<commit_message>
Update components, pages, and system guide
</commit_message>
<xml_diff>
--- a/GUSELA_System_Guide.docx
+++ b/GUSELA_System_Guide.docx
@@ -355,7 +355,7 @@
           <w:sz w:val="22"/>
           <w:szCs w:val="22"/>
         </w:rPr>
-        <w:t xml:space="preserve">  5.1   Ballot Page</w:t>
+        <w:t xml:space="preserve">  5.1   Ballot Page &amp; Digital Voting Engine</w:t>
       </w:r>
       <w:r>
         <w:rPr>
@@ -381,7 +381,7 @@
           <w:sz w:val="22"/>
           <w:szCs w:val="22"/>
         </w:rPr>
-        <w:t xml:space="preserve">  5.2   Confirmation Screen</w:t>
+        <w:t xml:space="preserve">  5.2   Cryptographic Digital Seal &amp; Confirmation</w:t>
       </w:r>
       <w:r>
         <w:rPr>
@@ -407,7 +407,7 @@
           <w:sz w:val="22"/>
           <w:szCs w:val="22"/>
         </w:rPr>
-        <w:t xml:space="preserve">  5.3   Student Profile</w:t>
+        <w:t xml:space="preserve">  5.3   Student Profile &amp; Biometrics Suite</w:t>
       </w:r>
       <w:r>
         <w:rPr>
@@ -433,7 +433,7 @@
           <w:sz w:val="22"/>
           <w:szCs w:val="22"/>
         </w:rPr>
-        <w:t xml:space="preserve">6.   Admin Module</w:t>
+        <w:t xml:space="preserve">6.   Faculty Admin Module</w:t>
       </w:r>
       <w:r>
         <w:rPr>
@@ -459,7 +459,7 @@
           <w:sz w:val="22"/>
           <w:szCs w:val="22"/>
         </w:rPr>
-        <w:t xml:space="preserve">  6.1   Dashboard — Candidates Setup</w:t>
+        <w:t xml:space="preserve">  6.1   Candidates List &amp; Management</w:t>
       </w:r>
       <w:r>
         <w:rPr>
@@ -485,7 +485,7 @@
           <w:sz w:val="22"/>
           <w:szCs w:val="22"/>
         </w:rPr>
-        <w:t xml:space="preserve">  6.2   Voters List</w:t>
+        <w:t xml:space="preserve">  6.2   Register Candidate &amp; Edit Candidate Forms</w:t>
       </w:r>
       <w:r>
         <w:rPr>
@@ -511,7 +511,7 @@
           <w:sz w:val="22"/>
           <w:szCs w:val="22"/>
         </w:rPr>
-        <w:t xml:space="preserve">  6.3   Voter Registration</w:t>
+        <w:t xml:space="preserve">  6.3   Candidate Profile Showcase</w:t>
       </w:r>
       <w:r>
         <w:rPr>
@@ -520,7 +520,7 @@
           <w:sz w:val="22"/>
           <w:szCs w:val="22"/>
         </w:rPr>
-        <w:t xml:space="preserve">	10</w:t>
+        <w:t xml:space="preserve">	9</w:t>
       </w:r>
     </w:p>
     <w:p>
@@ -537,7 +537,7 @@
           <w:sz w:val="22"/>
           <w:szCs w:val="22"/>
         </w:rPr>
-        <w:t xml:space="preserve">  6.4   Partylist Management</w:t>
+        <w:t xml:space="preserve">  6.4   Students List (Directory &amp; Security Controls)</w:t>
       </w:r>
       <w:r>
         <w:rPr>
@@ -563,7 +563,7 @@
           <w:sz w:val="22"/>
           <w:szCs w:val="22"/>
         </w:rPr>
-        <w:t xml:space="preserve">  6.5   Election Settings</w:t>
+        <w:t xml:space="preserve">  6.5   Register Student (Single Entry &amp; Bulk SheetJS)</w:t>
       </w:r>
       <w:r>
         <w:rPr>
@@ -572,7 +572,7 @@
           <w:sz w:val="22"/>
           <w:szCs w:val="22"/>
         </w:rPr>
-        <w:t xml:space="preserve">	11</w:t>
+        <w:t xml:space="preserve">	10</w:t>
       </w:r>
     </w:p>
     <w:p>
@@ -589,7 +589,7 @@
           <w:sz w:val="22"/>
           <w:szCs w:val="22"/>
         </w:rPr>
-        <w:t xml:space="preserve">  6.6   Results Dashboard</w:t>
+        <w:t xml:space="preserve">  6.6   Partylist Slate Management</w:t>
       </w:r>
       <w:r>
         <w:rPr>
@@ -615,7 +615,7 @@
           <w:sz w:val="22"/>
           <w:szCs w:val="22"/>
         </w:rPr>
-        <w:t xml:space="preserve">  6.7   Download Results</w:t>
+        <w:t xml:space="preserve">  6.7   Election Settings &amp; Cutoff Timer</w:t>
       </w:r>
       <w:r>
         <w:rPr>
@@ -624,7 +624,7 @@
           <w:sz w:val="22"/>
           <w:szCs w:val="22"/>
         </w:rPr>
-        <w:t xml:space="preserve">	12</w:t>
+        <w:t xml:space="preserve">	11</w:t>
       </w:r>
     </w:p>
     <w:p>
@@ -641,7 +641,7 @@
           <w:sz w:val="22"/>
           <w:szCs w:val="22"/>
         </w:rPr>
-        <w:t xml:space="preserve">  6.8   Audit Logs</w:t>
+        <w:t xml:space="preserve">  6.8   Results &amp; Analytics Dashboard</w:t>
       </w:r>
       <w:r>
         <w:rPr>
@@ -663,11 +663,11 @@
       <w:r>
         <w:rPr>
           <w:rFonts w:ascii="Calibri" w:cs="Calibri" w:eastAsia="Calibri" w:hAnsi="Calibri"/>
-          <w:color w:val="1A2B5F"/>
-          <w:sz w:val="22"/>
-          <w:szCs w:val="22"/>
-        </w:rPr>
-        <w:t xml:space="preserve">7.   Security Features</w:t>
+          <w:color w:val="64748B"/>
+          <w:sz w:val="22"/>
+          <w:szCs w:val="22"/>
+        </w:rPr>
+        <w:t xml:space="preserve">  6.9   Audit Logs &amp; Investigation Console</w:t>
       </w:r>
       <w:r>
         <w:rPr>
@@ -676,7 +676,7 @@
           <w:sz w:val="22"/>
           <w:szCs w:val="22"/>
         </w:rPr>
-        <w:t xml:space="preserve">	13</w:t>
+        <w:t xml:space="preserve">	12</w:t>
       </w:r>
     </w:p>
     <w:p>
@@ -689,11 +689,11 @@
       <w:r>
         <w:rPr>
           <w:rFonts w:ascii="Calibri" w:cs="Calibri" w:eastAsia="Calibri" w:hAnsi="Calibri"/>
-          <w:color w:val="1A2B5F"/>
-          <w:sz w:val="22"/>
-          <w:szCs w:val="22"/>
-        </w:rPr>
-        <w:t xml:space="preserve">8.   Audit Logging Reference</w:t>
+          <w:color w:val="64748B"/>
+          <w:sz w:val="22"/>
+          <w:szCs w:val="22"/>
+        </w:rPr>
+        <w:t xml:space="preserve">  6.10   Digital Seal Verification Console</w:t>
       </w:r>
       <w:r>
         <w:rPr>
@@ -702,7 +702,7 @@
           <w:sz w:val="22"/>
           <w:szCs w:val="22"/>
         </w:rPr>
-        <w:t xml:space="preserve">	14</w:t>
+        <w:t xml:space="preserve">	13</w:t>
       </w:r>
     </w:p>
     <w:p>
@@ -719,7 +719,7 @@
           <w:sz w:val="22"/>
           <w:szCs w:val="22"/>
         </w:rPr>
-        <w:t xml:space="preserve">9.   Database Tables Reference</w:t>
+        <w:t xml:space="preserve">7.   Core Security &amp; Verification Systems</w:t>
       </w:r>
       <w:r>
         <w:rPr>
@@ -728,7 +728,7 @@
           <w:sz w:val="22"/>
           <w:szCs w:val="22"/>
         </w:rPr>
-        <w:t xml:space="preserve">	15</w:t>
+        <w:t xml:space="preserve">	13</w:t>
       </w:r>
     </w:p>
     <w:p>
@@ -741,10 +741,166 @@
       <w:r>
         <w:rPr>
           <w:rFonts w:ascii="Calibri" w:cs="Calibri" w:eastAsia="Calibri" w:hAnsi="Calibri"/>
+          <w:color w:val="64748B"/>
+          <w:sz w:val="22"/>
+          <w:szCs w:val="22"/>
+        </w:rPr>
+        <w:t xml:space="preserve">  7.1   Face-API.js Biometric Facial Recognition</w:t>
+      </w:r>
+      <w:r>
+        <w:rPr>
+          <w:rFonts w:ascii="Calibri" w:cs="Calibri" w:eastAsia="Calibri" w:hAnsi="Calibri"/>
+          <w:color w:val="6366F1"/>
+          <w:sz w:val="22"/>
+          <w:szCs w:val="22"/>
+        </w:rPr>
+        <w:t xml:space="preserve">	13</w:t>
+      </w:r>
+    </w:p>
+    <w:p>
+      <w:pPr>
+        <w:tabs>
+          <w:tab w:val="right" w:pos="7920" w:leader="dot"/>
+        </w:tabs>
+        <w:spacing w:after="40" w:before="40"/>
+      </w:pPr>
+      <w:r>
+        <w:rPr>
+          <w:rFonts w:ascii="Calibri" w:cs="Calibri" w:eastAsia="Calibri" w:hAnsi="Calibri"/>
+          <w:color w:val="64748B"/>
+          <w:sz w:val="22"/>
+          <w:szCs w:val="22"/>
+        </w:rPr>
+        <w:t xml:space="preserve">  7.2   Campus GPS Geofencing (Haversine Formula)</w:t>
+      </w:r>
+      <w:r>
+        <w:rPr>
+          <w:rFonts w:ascii="Calibri" w:cs="Calibri" w:eastAsia="Calibri" w:hAnsi="Calibri"/>
+          <w:color w:val="6366F1"/>
+          <w:sz w:val="22"/>
+          <w:szCs w:val="22"/>
+        </w:rPr>
+        <w:t xml:space="preserve">	14</w:t>
+      </w:r>
+    </w:p>
+    <w:p>
+      <w:pPr>
+        <w:tabs>
+          <w:tab w:val="right" w:pos="7920" w:leader="dot"/>
+        </w:tabs>
+        <w:spacing w:after="40" w:before="40"/>
+      </w:pPr>
+      <w:r>
+        <w:rPr>
+          <w:rFonts w:ascii="Calibri" w:cs="Calibri" w:eastAsia="Calibri" w:hAnsi="Calibri"/>
+          <w:color w:val="64748B"/>
+          <w:sz w:val="22"/>
+          <w:szCs w:val="22"/>
+        </w:rPr>
+        <w:t xml:space="preserve">  7.3   Cryptographic Digital Seal (SHA-256 Engine)</w:t>
+      </w:r>
+      <w:r>
+        <w:rPr>
+          <w:rFonts w:ascii="Calibri" w:cs="Calibri" w:eastAsia="Calibri" w:hAnsi="Calibri"/>
+          <w:color w:val="6366F1"/>
+          <w:sz w:val="22"/>
+          <w:szCs w:val="22"/>
+        </w:rPr>
+        <w:t xml:space="preserve">	14</w:t>
+      </w:r>
+    </w:p>
+    <w:p>
+      <w:pPr>
+        <w:tabs>
+          <w:tab w:val="right" w:pos="7920" w:leader="dot"/>
+        </w:tabs>
+        <w:spacing w:after="40" w:before="40"/>
+      </w:pPr>
+      <w:r>
+        <w:rPr>
+          <w:rFonts w:ascii="Calibri" w:cs="Calibri" w:eastAsia="Calibri" w:hAnsi="Calibri"/>
+          <w:color w:val="64748B"/>
+          <w:sz w:val="22"/>
+          <w:szCs w:val="22"/>
+        </w:rPr>
+        <w:t xml:space="preserve">  7.4   Dual-Layer Rate Limiting &amp; Admin Password Gate</w:t>
+      </w:r>
+      <w:r>
+        <w:rPr>
+          <w:rFonts w:ascii="Calibri" w:cs="Calibri" w:eastAsia="Calibri" w:hAnsi="Calibri"/>
+          <w:color w:val="6366F1"/>
+          <w:sz w:val="22"/>
+          <w:szCs w:val="22"/>
+        </w:rPr>
+        <w:t xml:space="preserve">	14</w:t>
+      </w:r>
+    </w:p>
+    <w:p>
+      <w:pPr>
+        <w:tabs>
+          <w:tab w:val="right" w:pos="7920" w:leader="dot"/>
+        </w:tabs>
+        <w:spacing w:after="40" w:before="40"/>
+      </w:pPr>
+      <w:r>
+        <w:rPr>
+          <w:rFonts w:ascii="Calibri" w:cs="Calibri" w:eastAsia="Calibri" w:hAnsi="Calibri"/>
           <w:color w:val="1A2B5F"/>
           <w:sz w:val="22"/>
           <w:szCs w:val="22"/>
         </w:rPr>
+        <w:t xml:space="preserve">8.   Audit Logging Reference</w:t>
+      </w:r>
+      <w:r>
+        <w:rPr>
+          <w:rFonts w:ascii="Calibri" w:cs="Calibri" w:eastAsia="Calibri" w:hAnsi="Calibri"/>
+          <w:color w:val="6366F1"/>
+          <w:sz w:val="22"/>
+          <w:szCs w:val="22"/>
+        </w:rPr>
+        <w:t xml:space="preserve">	15</w:t>
+      </w:r>
+    </w:p>
+    <w:p>
+      <w:pPr>
+        <w:tabs>
+          <w:tab w:val="right" w:pos="7920" w:leader="dot"/>
+        </w:tabs>
+        <w:spacing w:after="40" w:before="40"/>
+      </w:pPr>
+      <w:r>
+        <w:rPr>
+          <w:rFonts w:ascii="Calibri" w:cs="Calibri" w:eastAsia="Calibri" w:hAnsi="Calibri"/>
+          <w:color w:val="1A2B5F"/>
+          <w:sz w:val="22"/>
+          <w:szCs w:val="22"/>
+        </w:rPr>
+        <w:t xml:space="preserve">9.   Database Tables Reference</w:t>
+      </w:r>
+      <w:r>
+        <w:rPr>
+          <w:rFonts w:ascii="Calibri" w:cs="Calibri" w:eastAsia="Calibri" w:hAnsi="Calibri"/>
+          <w:color w:val="6366F1"/>
+          <w:sz w:val="22"/>
+          <w:szCs w:val="22"/>
+        </w:rPr>
+        <w:t xml:space="preserve">	16</w:t>
+      </w:r>
+    </w:p>
+    <w:p>
+      <w:pPr>
+        <w:tabs>
+          <w:tab w:val="right" w:pos="7920" w:leader="dot"/>
+        </w:tabs>
+        <w:spacing w:after="40" w:before="40"/>
+      </w:pPr>
+      <w:r>
+        <w:rPr>
+          <w:rFonts w:ascii="Calibri" w:cs="Calibri" w:eastAsia="Calibri" w:hAnsi="Calibri"/>
+          <w:color w:val="1A2B5F"/>
+          <w:sz w:val="22"/>
+          <w:szCs w:val="22"/>
+        </w:rPr>
         <w:t xml:space="preserve">10.   Troubleshooting &amp; FAQ</w:t>
       </w:r>
       <w:r>
@@ -754,7 +910,7 @@
           <w:sz w:val="22"/>
           <w:szCs w:val="22"/>
         </w:rPr>
-        <w:t xml:space="preserve">	16</w:t>
+        <w:t xml:space="preserve">	17</w:t>
       </w:r>
     </w:p>
     <w:p>
@@ -3839,7 +3995,7 @@
           <w:sz w:val="26"/>
           <w:szCs w:val="26"/>
         </w:rPr>
-        <w:t xml:space="preserve">6.1  Dashboard — Candidates Setup</w:t>
+        <w:t xml:space="preserve">6.1  Candidates List &amp; Management</w:t>
       </w:r>
     </w:p>
     <w:p>
@@ -3858,7 +4014,7 @@
           <w:sz w:val="22"/>
           <w:szCs w:val="22"/>
         </w:rPr>
-        <w:t xml:space="preserve">The main admin landing page. Displays all candidates organized by position.</w:t>
+        <w:t xml:space="preserve">The main administrative candidate directory. Displays all running candidates categorized under collapsible position accordions (President, Vice-President, Secretary, Treasurer, Auditor, PIO, Representatives).</w:t>
       </w:r>
     </w:p>
     <w:p>
@@ -3893,7 +4049,7 @@
           <w:sz w:val="22"/>
           <w:szCs w:val="22"/>
         </w:rPr>
-        <w:t xml:space="preserve">Filters</w:t>
+        <w:t xml:space="preserve">Multi-Criteria Filtering &amp; Scoped Search</w:t>
       </w:r>
     </w:p>
     <w:p>
@@ -3917,7 +4073,7 @@
           <w:sz w:val="22"/>
           <w:szCs w:val="22"/>
         </w:rPr>
-        <w:t xml:space="preserve">Status Filter: All / Active / Deactivated</w:t>
+        <w:t xml:space="preserve">Status Filter: All Candidates / Active Only / Deactivated Only</w:t>
       </w:r>
     </w:p>
     <w:p>
@@ -3941,7 +4097,7 @@
           <w:sz w:val="22"/>
           <w:szCs w:val="22"/>
         </w:rPr>
-        <w:t xml:space="preserve">Partylist Filter: All partylists or a specific one</w:t>
+        <w:t xml:space="preserve">Partylist Filter: Scoped to specific registered slates or independent</w:t>
       </w:r>
     </w:p>
     <w:p>
@@ -3965,7 +4121,7 @@
           <w:sz w:val="22"/>
           <w:szCs w:val="22"/>
         </w:rPr>
-        <w:t xml:space="preserve">Section Filter: All or a specific class section</w:t>
+        <w:t xml:space="preserve">Section Filter: Scoped to standard Grade 7-12 strands or junior sections</w:t>
       </w:r>
     </w:p>
     <w:p>
@@ -3989,7 +4145,7 @@
           <w:sz w:val="22"/>
           <w:szCs w:val="22"/>
         </w:rPr>
-        <w:t xml:space="preserve">Search Bar: search by candidate name</w:t>
+        <w:t xml:space="preserve">Candidate Search: Scoped search by candidate first, middle, or last name</w:t>
       </w:r>
     </w:p>
     <w:p>
@@ -4024,7 +4180,7 @@
           <w:sz w:val="22"/>
           <w:szCs w:val="22"/>
         </w:rPr>
-        <w:t xml:space="preserve">Candidate Actions (per card)</w:t>
+        <w:t xml:space="preserve">Candidate Card Features &amp; Actions</w:t>
       </w:r>
     </w:p>
     <w:tbl>
@@ -4062,7 +4218,7 @@
                 <w:sz w:val="20"/>
                 <w:szCs w:val="20"/>
               </w:rPr>
-              <w:t xml:space="preserve">View Profile</w:t>
+              <w:t xml:space="preserve">Standardized Header</w:t>
             </w:r>
           </w:p>
         </w:tc>
@@ -4083,7 +4239,7 @@
                 <w:sz w:val="20"/>
                 <w:szCs w:val="20"/>
               </w:rPr>
-              <w:t xml:space="preserve">Opens the full Candidate Profile page</w:t>
+              <w:t xml:space="preserve">Uniformly renders Position • Partylist • Grade &amp; Section (e.g. "Grade 12 - STEM-A")</w:t>
             </w:r>
           </w:p>
         </w:tc>
@@ -4106,7 +4262,7 @@
                 <w:sz w:val="20"/>
                 <w:szCs w:val="20"/>
               </w:rPr>
-              <w:t xml:space="preserve">Edit</w:t>
+              <w:t xml:space="preserve">View Profile</w:t>
             </w:r>
           </w:p>
         </w:tc>
@@ -4127,7 +4283,7 @@
                 <w:sz w:val="20"/>
                 <w:szCs w:val="20"/>
               </w:rPr>
-              <w:t xml:space="preserve">Opens the Admin Edit Candidate form</w:t>
+              <w:t xml:space="preserve">Navigates to the public Candidate Profile showcase</w:t>
             </w:r>
           </w:p>
         </w:tc>
@@ -4151,7 +4307,7 @@
                 <w:sz w:val="20"/>
                 <w:szCs w:val="20"/>
               </w:rPr>
-              <w:t xml:space="preserve">Deactivate / Reactivate</w:t>
+              <w:t xml:space="preserve">Edit Candidate</w:t>
             </w:r>
           </w:p>
         </w:tc>
@@ -4172,7 +4328,7 @@
                 <w:sz w:val="20"/>
                 <w:szCs w:val="20"/>
               </w:rPr>
-              <w:t xml:space="preserve">Hides the candidate from student ballot without deleting them</w:t>
+              <w:t xml:space="preserve">Navigates to AdminEditCandidate form with full prefilled fields</w:t>
             </w:r>
           </w:p>
         </w:tc>
@@ -4195,7 +4351,7 @@
                 <w:sz w:val="20"/>
                 <w:szCs w:val="20"/>
               </w:rPr>
-              <w:t xml:space="preserve">Remove Partylist</w:t>
+              <w:t xml:space="preserve">Soft Deactivation</w:t>
             </w:r>
           </w:p>
         </w:tc>
@@ -4216,12 +4372,111 @@
                 <w:sz w:val="20"/>
                 <w:szCs w:val="20"/>
               </w:rPr>
-              <w:t xml:space="preserve">Unlinks the candidate's partylist affiliation (logged to audit)</w:t>
+              <w:t xml:space="preserve">Toggles is_active flag in Supabase to instantly hide from voting ballot without losing data</w:t>
+            </w:r>
+          </w:p>
+        </w:tc>
+      </w:tr>
+      <w:tr>
+        <w:tc>
+          <w:tcPr>
+            <w:tcW w:type="pct" w:w="1500"/>
+            <w:shd w:color="F1F5F9" w:val="solid"/>
+            <w:vAlign w:val="center"/>
+          </w:tcPr>
+          <w:p>
+            <w:r>
+              <w:rPr>
+                <w:rFonts w:ascii="Calibri" w:cs="Calibri" w:eastAsia="Calibri" w:hAnsi="Calibri"/>
+                <w:b/>
+                <w:bCs/>
+                <w:i w:val="false"/>
+                <w:iCs w:val="false"/>
+                <w:color w:val="1A2B5F"/>
+                <w:sz w:val="20"/>
+                <w:szCs w:val="20"/>
+              </w:rPr>
+              <w:t xml:space="preserve">Remove Partylist</w:t>
+            </w:r>
+          </w:p>
+        </w:tc>
+        <w:tc>
+          <w:tcPr>
+            <w:tcW w:type="pct" w:w="3500"/>
+            <w:vAlign w:val="center"/>
+          </w:tcPr>
+          <w:p>
+            <w:r>
+              <w:rPr>
+                <w:rFonts w:ascii="Calibri" w:cs="Calibri" w:eastAsia="Calibri" w:hAnsi="Calibri"/>
+                <w:b w:val="false"/>
+                <w:bCs w:val="false"/>
+                <w:i w:val="false"/>
+                <w:iCs w:val="false"/>
+                <w:color w:val="1E293B"/>
+                <w:sz w:val="20"/>
+                <w:szCs w:val="20"/>
+              </w:rPr>
+              <w:t xml:space="preserve">Detaches candidate from slate affiliation and logs ACTION_CANDIDATE_UPDATED in audit trail</w:t>
             </w:r>
           </w:p>
         </w:tc>
       </w:tr>
     </w:tbl>
+    <w:p>
+      <w:pPr>
+        <w:spacing w:after="0" w:before="0"/>
+      </w:pPr>
+      <w:r>
+        <w:rPr>
+          <w:rFonts w:ascii="Calibri" w:cs="Calibri" w:eastAsia="Calibri" w:hAnsi="Calibri"/>
+          <w:b w:val="false"/>
+          <w:bCs w:val="false"/>
+          <w:i w:val="false"/>
+          <w:iCs w:val="false"/>
+          <w:color w:val="1E293B"/>
+          <w:sz w:val="22"/>
+          <w:szCs w:val="22"/>
+        </w:rPr>
+        <w:t xml:space="preserve"/>
+      </w:r>
+    </w:p>
+    <w:p>
+      <w:pPr>
+        <w:pStyle w:val="Heading2"/>
+        <w:spacing w:after="100" w:before="300"/>
+      </w:pPr>
+      <w:r>
+        <w:rPr>
+          <w:rFonts w:ascii="Calibri" w:cs="Calibri" w:eastAsia="Calibri" w:hAnsi="Calibri"/>
+          <w:b/>
+          <w:bCs/>
+          <w:color w:val="6366F1"/>
+          <w:sz w:val="26"/>
+          <w:szCs w:val="26"/>
+        </w:rPr>
+        <w:t xml:space="preserve">6.2  Register Candidate &amp; Edit Candidate Forms</w:t>
+      </w:r>
+    </w:p>
+    <w:p>
+      <w:pPr>
+        <w:spacing w:after="60" w:before="60"/>
+        <w:jc w:val="left"/>
+      </w:pPr>
+      <w:r>
+        <w:rPr>
+          <w:rFonts w:ascii="Calibri" w:cs="Calibri" w:eastAsia="Calibri" w:hAnsi="Calibri"/>
+          <w:b w:val="false"/>
+          <w:bCs w:val="false"/>
+          <w:i w:val="false"/>
+          <w:iCs w:val="false"/>
+          <w:color w:val="1E293B"/>
+          <w:sz w:val="22"/>
+          <w:szCs w:val="22"/>
+        </w:rPr>
+        <w:t xml:space="preserve">Comprehensive forms for creating and updating candidate nominations with standardized layout and validation.</w:t>
+      </w:r>
+    </w:p>
     <w:p>
       <w:pPr>
         <w:spacing w:after="0" w:before="0"/>
@@ -4254,7 +4509,7 @@
           <w:sz w:val="22"/>
           <w:szCs w:val="22"/>
         </w:rPr>
-        <w:t xml:space="preserve">Global Actions</w:t>
+        <w:t xml:space="preserve">Key Form Features &amp; Alignment</w:t>
       </w:r>
     </w:p>
     <w:p>
@@ -4278,96 +4533,7 @@
           <w:sz w:val="22"/>
           <w:szCs w:val="22"/>
         </w:rPr>
-        <w:t xml:space="preserve">"+ Add Candidate" button — navigates to the Add Candidate form</w:t>
-      </w:r>
-    </w:p>
-    <w:p>
-      <w:pPr>
-        <w:spacing w:after="0" w:before="0"/>
-      </w:pPr>
-      <w:r>
-        <w:rPr>
-          <w:rFonts w:ascii="Calibri" w:cs="Calibri" w:eastAsia="Calibri" w:hAnsi="Calibri"/>
-          <w:b w:val="false"/>
-          <w:bCs w:val="false"/>
-          <w:i w:val="false"/>
-          <w:iCs w:val="false"/>
-          <w:color w:val="1E293B"/>
-          <w:sz w:val="22"/>
-          <w:szCs w:val="22"/>
-        </w:rPr>
-        <w:t xml:space="preserve"/>
-      </w:r>
-    </w:p>
-    <w:p>
-      <w:pPr>
-        <w:pStyle w:val="Heading2"/>
-        <w:spacing w:after="100" w:before="300"/>
-      </w:pPr>
-      <w:r>
-        <w:rPr>
-          <w:rFonts w:ascii="Calibri" w:cs="Calibri" w:eastAsia="Calibri" w:hAnsi="Calibri"/>
-          <w:b/>
-          <w:bCs/>
-          <w:color w:val="6366F1"/>
-          <w:sz w:val="26"/>
-          <w:szCs w:val="26"/>
-        </w:rPr>
-        <w:t xml:space="preserve">6.2  Voters List</w:t>
-      </w:r>
-    </w:p>
-    <w:p>
-      <w:pPr>
-        <w:spacing w:after="60" w:before="60"/>
-        <w:jc w:val="left"/>
-      </w:pPr>
-      <w:r>
-        <w:rPr>
-          <w:rFonts w:ascii="Calibri" w:cs="Calibri" w:eastAsia="Calibri" w:hAnsi="Calibri"/>
-          <w:b w:val="false"/>
-          <w:bCs w:val="false"/>
-          <w:i w:val="false"/>
-          <w:iCs w:val="false"/>
-          <w:color w:val="1E293B"/>
-          <w:sz w:val="22"/>
-          <w:szCs w:val="22"/>
-        </w:rPr>
-        <w:t xml:space="preserve">Displays all registered student voters with their voting status in real time.</w:t>
-      </w:r>
-    </w:p>
-    <w:p>
-      <w:pPr>
-        <w:spacing w:after="0" w:before="0"/>
-      </w:pPr>
-      <w:r>
-        <w:rPr>
-          <w:rFonts w:ascii="Calibri" w:cs="Calibri" w:eastAsia="Calibri" w:hAnsi="Calibri"/>
-          <w:b w:val="false"/>
-          <w:bCs w:val="false"/>
-          <w:i w:val="false"/>
-          <w:iCs w:val="false"/>
-          <w:color w:val="1E293B"/>
-          <w:sz w:val="22"/>
-          <w:szCs w:val="22"/>
-        </w:rPr>
-        <w:t xml:space="preserve"/>
-      </w:r>
-    </w:p>
-    <w:p>
-      <w:pPr>
-        <w:pStyle w:val="Heading3"/>
-        <w:spacing w:after="80" w:before="200"/>
-      </w:pPr>
-      <w:r>
-        <w:rPr>
-          <w:rFonts w:ascii="Calibri" w:cs="Calibri" w:eastAsia="Calibri" w:hAnsi="Calibri"/>
-          <w:b/>
-          <w:bCs/>
-          <w:color w:val="0D9488"/>
-          <w:sz w:val="22"/>
-          <w:szCs w:val="22"/>
-        </w:rPr>
-        <w:t xml:space="preserve">Filters</w:t>
+        <w:t xml:space="preserve">3-Box Name Inputs: First Name, Middle Name, Last Name with shared bottom-baseline alignment</w:t>
       </w:r>
     </w:p>
     <w:p>
@@ -4391,7 +4557,7 @@
           <w:sz w:val="22"/>
           <w:szCs w:val="22"/>
         </w:rPr>
-        <w:t xml:space="preserve">Grade Filter: All / Gr 7 – Gr 12</w:t>
+        <w:t xml:space="preserve">Standardized Position Selector: Predefined SSLG positions with custom position auto-suggestions</w:t>
       </w:r>
     </w:p>
     <w:p>
@@ -4415,7 +4581,7 @@
           <w:sz w:val="22"/>
           <w:szCs w:val="22"/>
         </w:rPr>
-        <w:t xml:space="preserve">Status Filter: All / Voted / Pending</w:t>
+        <w:t xml:space="preserve">Dependent Section Selector: Selecting Grade 11 or 12 automatically restricts section choices to senior strands (STEM-A, STEM-B, GAS, HUMSS-A, etc.), while Grades 7-10 display section names (Luna, Mabini, Bonifacio, etc.)</w:t>
       </w:r>
     </w:p>
     <w:p>
@@ -4439,7 +4605,85 @@
           <w:sz w:val="22"/>
           <w:szCs w:val="22"/>
         </w:rPr>
-        <w:t xml:space="preserve">Search: filter by name or LRN</w:t>
+        <w:t xml:space="preserve">Dual Photo Capture: Upload image file with client-side compression or live snapshot via webcam</w:t>
+      </w:r>
+    </w:p>
+    <w:p>
+      <w:pPr>
+        <w:pStyle w:val="ListParagraph"/>
+        <w:numPr>
+          <w:ilvl w:val="0"/>
+          <w:numId w:val="1"/>
+        </w:numPr>
+        <w:spacing w:after="40" w:before="40"/>
+        <w:ind w:left="360"/>
+      </w:pPr>
+      <w:r>
+        <w:rPr>
+          <w:rFonts w:ascii="Calibri" w:cs="Calibri" w:eastAsia="Calibri" w:hAnsi="Calibri"/>
+          <w:b w:val="false"/>
+          <w:bCs w:val="false"/>
+          <w:i w:val="false"/>
+          <w:iCs w:val="false"/>
+          <w:color w:val="1E293B"/>
+          <w:sz w:val="22"/>
+          <w:szCs w:val="22"/>
+        </w:rPr>
+        <w:t xml:space="preserve">Format Normalization: Automatically runs formatGradeSection() to guarantee unified naming across the platform</w:t>
+      </w:r>
+    </w:p>
+    <w:p>
+      <w:pPr>
+        <w:spacing w:after="0" w:before="0"/>
+      </w:pPr>
+      <w:r>
+        <w:rPr>
+          <w:rFonts w:ascii="Calibri" w:cs="Calibri" w:eastAsia="Calibri" w:hAnsi="Calibri"/>
+          <w:b w:val="false"/>
+          <w:bCs w:val="false"/>
+          <w:i w:val="false"/>
+          <w:iCs w:val="false"/>
+          <w:color w:val="1E293B"/>
+          <w:sz w:val="22"/>
+          <w:szCs w:val="22"/>
+        </w:rPr>
+        <w:t xml:space="preserve"/>
+      </w:r>
+    </w:p>
+    <w:p>
+      <w:pPr>
+        <w:pStyle w:val="Heading2"/>
+        <w:spacing w:after="100" w:before="300"/>
+      </w:pPr>
+      <w:r>
+        <w:rPr>
+          <w:rFonts w:ascii="Calibri" w:cs="Calibri" w:eastAsia="Calibri" w:hAnsi="Calibri"/>
+          <w:b/>
+          <w:bCs/>
+          <w:color w:val="6366F1"/>
+          <w:sz w:val="26"/>
+          <w:szCs w:val="26"/>
+        </w:rPr>
+        <w:t xml:space="preserve">6.3  Candidate Profile Showcase</w:t>
+      </w:r>
+    </w:p>
+    <w:p>
+      <w:pPr>
+        <w:spacing w:after="60" w:before="60"/>
+        <w:jc w:val="left"/>
+      </w:pPr>
+      <w:r>
+        <w:rPr>
+          <w:rFonts w:ascii="Calibri" w:cs="Calibri" w:eastAsia="Calibri" w:hAnsi="Calibri"/>
+          <w:b w:val="false"/>
+          <w:bCs w:val="false"/>
+          <w:i w:val="false"/>
+          <w:iCs w:val="false"/>
+          <w:color w:val="1E293B"/>
+          <w:sz w:val="22"/>
+          <w:szCs w:val="22"/>
+        </w:rPr>
+        <w:t xml:space="preserve">Rich candidate showcase page accessible by both administrators and student voters before voting.</w:t>
       </w:r>
     </w:p>
     <w:p>
@@ -4474,7 +4718,299 @@
           <w:sz w:val="22"/>
           <w:szCs w:val="22"/>
         </w:rPr>
-        <w:t xml:space="preserve">Per-Student Actions</w:t>
+        <w:t xml:space="preserve">Showcase Elements</w:t>
+      </w:r>
+    </w:p>
+    <w:p>
+      <w:pPr>
+        <w:pStyle w:val="ListParagraph"/>
+        <w:numPr>
+          <w:ilvl w:val="0"/>
+          <w:numId w:val="1"/>
+        </w:numPr>
+        <w:spacing w:after="40" w:before="40"/>
+        <w:ind w:left="360"/>
+      </w:pPr>
+      <w:r>
+        <w:rPr>
+          <w:rFonts w:ascii="Calibri" w:cs="Calibri" w:eastAsia="Calibri" w:hAnsi="Calibri"/>
+          <w:b w:val="false"/>
+          <w:bCs w:val="false"/>
+          <w:i w:val="false"/>
+          <w:iCs w:val="false"/>
+          <w:color w:val="1E293B"/>
+          <w:sz w:val="22"/>
+          <w:szCs w:val="22"/>
+        </w:rPr>
+        <w:t xml:space="preserve">Candidate Hero Banner: High-resolution profile avatar with official partylist color ribbon and badge</w:t>
+      </w:r>
+    </w:p>
+    <w:p>
+      <w:pPr>
+        <w:pStyle w:val="ListParagraph"/>
+        <w:numPr>
+          <w:ilvl w:val="0"/>
+          <w:numId w:val="1"/>
+        </w:numPr>
+        <w:spacing w:after="40" w:before="40"/>
+        <w:ind w:left="360"/>
+      </w:pPr>
+      <w:r>
+        <w:rPr>
+          <w:rFonts w:ascii="Calibri" w:cs="Calibri" w:eastAsia="Calibri" w:hAnsi="Calibri"/>
+          <w:b w:val="false"/>
+          <w:bCs w:val="false"/>
+          <w:i w:val="false"/>
+          <w:iCs w:val="false"/>
+          <w:color w:val="1E293B"/>
+          <w:sz w:val="22"/>
+          <w:szCs w:val="22"/>
+        </w:rPr>
+        <w:t xml:space="preserve">Standardized Subtitle: Uniform "Position • Partylist • Grade &amp; Section" header</w:t>
+      </w:r>
+    </w:p>
+    <w:p>
+      <w:pPr>
+        <w:pStyle w:val="ListParagraph"/>
+        <w:numPr>
+          <w:ilvl w:val="0"/>
+          <w:numId w:val="1"/>
+        </w:numPr>
+        <w:spacing w:after="40" w:before="40"/>
+        <w:ind w:left="360"/>
+      </w:pPr>
+      <w:r>
+        <w:rPr>
+          <w:rFonts w:ascii="Calibri" w:cs="Calibri" w:eastAsia="Calibri" w:hAnsi="Calibri"/>
+          <w:b w:val="false"/>
+          <w:bCs w:val="false"/>
+          <w:i w:val="false"/>
+          <w:iCs w:val="false"/>
+          <w:color w:val="1E293B"/>
+          <w:sz w:val="22"/>
+          <w:szCs w:val="22"/>
+        </w:rPr>
+        <w:t xml:space="preserve">Advocacies &amp; Platform: Formatted vision statement, platform goals, and past leadership credentials</w:t>
+      </w:r>
+    </w:p>
+    <w:p>
+      <w:pPr>
+        <w:pStyle w:val="ListParagraph"/>
+        <w:numPr>
+          <w:ilvl w:val="0"/>
+          <w:numId w:val="1"/>
+        </w:numPr>
+        <w:spacing w:after="40" w:before="40"/>
+        <w:ind w:left="360"/>
+      </w:pPr>
+      <w:r>
+        <w:rPr>
+          <w:rFonts w:ascii="Calibri" w:cs="Calibri" w:eastAsia="Calibri" w:hAnsi="Calibri"/>
+          <w:b w:val="false"/>
+          <w:bCs w:val="false"/>
+          <w:i w:val="false"/>
+          <w:iCs w:val="false"/>
+          <w:color w:val="1E293B"/>
+          <w:sz w:val="22"/>
+          <w:szCs w:val="22"/>
+        </w:rPr>
+        <w:t xml:space="preserve">Voter Return Button: Safe return link taking student back to their active voting ballot</w:t>
+      </w:r>
+    </w:p>
+    <w:p>
+      <w:pPr>
+        <w:spacing w:after="0" w:before="0"/>
+      </w:pPr>
+      <w:r>
+        <w:rPr>
+          <w:rFonts w:ascii="Calibri" w:cs="Calibri" w:eastAsia="Calibri" w:hAnsi="Calibri"/>
+          <w:b w:val="false"/>
+          <w:bCs w:val="false"/>
+          <w:i w:val="false"/>
+          <w:iCs w:val="false"/>
+          <w:color w:val="1E293B"/>
+          <w:sz w:val="22"/>
+          <w:szCs w:val="22"/>
+        </w:rPr>
+        <w:t xml:space="preserve"/>
+      </w:r>
+    </w:p>
+    <w:p>
+      <w:pPr>
+        <w:pStyle w:val="Heading2"/>
+        <w:spacing w:after="100" w:before="300"/>
+      </w:pPr>
+      <w:r>
+        <w:rPr>
+          <w:rFonts w:ascii="Calibri" w:cs="Calibri" w:eastAsia="Calibri" w:hAnsi="Calibri"/>
+          <w:b/>
+          <w:bCs/>
+          <w:color w:val="6366F1"/>
+          <w:sz w:val="26"/>
+          <w:szCs w:val="26"/>
+        </w:rPr>
+        <w:t xml:space="preserve">6.4  Students List (Directory &amp; Security Controls)</w:t>
+      </w:r>
+    </w:p>
+    <w:p>
+      <w:pPr>
+        <w:spacing w:after="60" w:before="60"/>
+        <w:jc w:val="left"/>
+      </w:pPr>
+      <w:r>
+        <w:rPr>
+          <w:rFonts w:ascii="Calibri" w:cs="Calibri" w:eastAsia="Calibri" w:hAnsi="Calibri"/>
+          <w:b w:val="false"/>
+          <w:bCs w:val="false"/>
+          <w:i w:val="false"/>
+          <w:iCs w:val="false"/>
+          <w:color w:val="1E293B"/>
+          <w:sz w:val="22"/>
+          <w:szCs w:val="22"/>
+        </w:rPr>
+        <w:t xml:space="preserve">The central student voter registry. Displays all registered student voters with real-time voting status and credential controls.</w:t>
+      </w:r>
+    </w:p>
+    <w:p>
+      <w:pPr>
+        <w:spacing w:after="0" w:before="0"/>
+      </w:pPr>
+      <w:r>
+        <w:rPr>
+          <w:rFonts w:ascii="Calibri" w:cs="Calibri" w:eastAsia="Calibri" w:hAnsi="Calibri"/>
+          <w:b w:val="false"/>
+          <w:bCs w:val="false"/>
+          <w:i w:val="false"/>
+          <w:iCs w:val="false"/>
+          <w:color w:val="1E293B"/>
+          <w:sz w:val="22"/>
+          <w:szCs w:val="22"/>
+        </w:rPr>
+        <w:t xml:space="preserve"/>
+      </w:r>
+    </w:p>
+    <w:p>
+      <w:pPr>
+        <w:pStyle w:val="Heading3"/>
+        <w:spacing w:after="80" w:before="200"/>
+      </w:pPr>
+      <w:r>
+        <w:rPr>
+          <w:rFonts w:ascii="Calibri" w:cs="Calibri" w:eastAsia="Calibri" w:hAnsi="Calibri"/>
+          <w:b/>
+          <w:bCs/>
+          <w:color w:val="0D9488"/>
+          <w:sz w:val="22"/>
+          <w:szCs w:val="22"/>
+        </w:rPr>
+        <w:t xml:space="preserve">Directory Features</w:t>
+      </w:r>
+    </w:p>
+    <w:p>
+      <w:pPr>
+        <w:pStyle w:val="ListParagraph"/>
+        <w:numPr>
+          <w:ilvl w:val="0"/>
+          <w:numId w:val="1"/>
+        </w:numPr>
+        <w:spacing w:after="40" w:before="40"/>
+        <w:ind w:left="360"/>
+      </w:pPr>
+      <w:r>
+        <w:rPr>
+          <w:rFonts w:ascii="Calibri" w:cs="Calibri" w:eastAsia="Calibri" w:hAnsi="Calibri"/>
+          <w:b w:val="false"/>
+          <w:bCs w:val="false"/>
+          <w:i w:val="false"/>
+          <w:iCs w:val="false"/>
+          <w:color w:val="1E293B"/>
+          <w:sz w:val="22"/>
+          <w:szCs w:val="22"/>
+        </w:rPr>
+        <w:t xml:space="preserve">Faculty Admin Exclusion: System automatically filters out admin accounts so only student voters appear in the registry</w:t>
+      </w:r>
+    </w:p>
+    <w:p>
+      <w:pPr>
+        <w:pStyle w:val="ListParagraph"/>
+        <w:numPr>
+          <w:ilvl w:val="0"/>
+          <w:numId w:val="1"/>
+        </w:numPr>
+        <w:spacing w:after="40" w:before="40"/>
+        <w:ind w:left="360"/>
+      </w:pPr>
+      <w:r>
+        <w:rPr>
+          <w:rFonts w:ascii="Calibri" w:cs="Calibri" w:eastAsia="Calibri" w:hAnsi="Calibri"/>
+          <w:b w:val="false"/>
+          <w:bCs w:val="false"/>
+          <w:i w:val="false"/>
+          <w:iCs w:val="false"/>
+          <w:color w:val="1E293B"/>
+          <w:sz w:val="22"/>
+          <w:szCs w:val="22"/>
+        </w:rPr>
+        <w:t xml:space="preserve">Duplicate Name Disambiguation: Detects identical names (e.g. two "Ana Reyes") and renders a distinct "Duplicate Name - Verify LRN" badge with Grade/Section tags</w:t>
+      </w:r>
+    </w:p>
+    <w:p>
+      <w:pPr>
+        <w:pStyle w:val="ListParagraph"/>
+        <w:numPr>
+          <w:ilvl w:val="0"/>
+          <w:numId w:val="1"/>
+        </w:numPr>
+        <w:spacing w:after="40" w:before="40"/>
+        <w:ind w:left="360"/>
+      </w:pPr>
+      <w:r>
+        <w:rPr>
+          <w:rFonts w:ascii="Calibri" w:cs="Calibri" w:eastAsia="Calibri" w:hAnsi="Calibri"/>
+          <w:b w:val="false"/>
+          <w:bCs w:val="false"/>
+          <w:i w:val="false"/>
+          <w:iCs w:val="false"/>
+          <w:color w:val="1E293B"/>
+          <w:sz w:val="22"/>
+          <w:szCs w:val="22"/>
+        </w:rPr>
+        <w:t xml:space="preserve">Masked Passcode Security: Passwords are permanently masked as "••••••••" with no plain-text database leakage</w:t>
+      </w:r>
+    </w:p>
+    <w:p>
+      <w:pPr>
+        <w:spacing w:after="0" w:before="0"/>
+      </w:pPr>
+      <w:r>
+        <w:rPr>
+          <w:rFonts w:ascii="Calibri" w:cs="Calibri" w:eastAsia="Calibri" w:hAnsi="Calibri"/>
+          <w:b w:val="false"/>
+          <w:bCs w:val="false"/>
+          <w:i w:val="false"/>
+          <w:iCs w:val="false"/>
+          <w:color w:val="1E293B"/>
+          <w:sz w:val="22"/>
+          <w:szCs w:val="22"/>
+        </w:rPr>
+        <w:t xml:space="preserve"/>
+      </w:r>
+    </w:p>
+    <w:p>
+      <w:pPr>
+        <w:pStyle w:val="Heading3"/>
+        <w:spacing w:after="80" w:before="200"/>
+      </w:pPr>
+      <w:r>
+        <w:rPr>
+          <w:rFonts w:ascii="Calibri" w:cs="Calibri" w:eastAsia="Calibri" w:hAnsi="Calibri"/>
+          <w:b/>
+          <w:bCs/>
+          <w:color w:val="0D9488"/>
+          <w:sz w:val="22"/>
+          <w:szCs w:val="22"/>
+        </w:rPr>
+        <w:t xml:space="preserve">Administrative Actions (Password-Protected)</w:t>
       </w:r>
     </w:p>
     <w:tbl>
@@ -4533,7 +5069,7 @@
                 <w:sz w:val="20"/>
                 <w:szCs w:val="20"/>
               </w:rPr>
-              <w:t xml:space="preserve">Opens the full Student Profile page</w:t>
+              <w:t xml:space="preserve">Opens the Student Profile with biometrics suite and GPS audit details</w:t>
             </w:r>
           </w:p>
         </w:tc>
@@ -4556,7 +5092,7 @@
                 <w:sz w:val="20"/>
                 <w:szCs w:val="20"/>
               </w:rPr>
-              <w:t xml:space="preserve">Show Password (Eye icon)</w:t>
+              <w:t xml:space="preserve">Temp Passcode Generator</w:t>
             </w:r>
           </w:p>
         </w:tc>
@@ -4577,7 +5113,7 @@
                 <w:sz w:val="20"/>
                 <w:szCs w:val="20"/>
               </w:rPr>
-              <w:t xml:space="preserve">Prompts for admin password; reveals the student's login password in-table</w:t>
+              <w:t xml:space="preserve">Prompts for faculty password, generates an ephemeral 6-digit passcode for immediate voter login assistance, and logs SECURITY_ACCESS_KEY_REVEALED</w:t>
             </w:r>
           </w:p>
         </w:tc>
@@ -4622,12 +5158,137 @@
                 <w:sz w:val="20"/>
                 <w:szCs w:val="20"/>
               </w:rPr>
-              <w:t xml:space="preserve">Prompts for admin password; deletes the student's vote records and resets has_voted to false</w:t>
+              <w:t xml:space="preserve">Prompts for faculty password, safely removes vote records from Supabase, restores has_voted to false, and logs VOTE_STATUS_RESET with justification</w:t>
+            </w:r>
+          </w:p>
+        </w:tc>
+      </w:tr>
+      <w:tr>
+        <w:tc>
+          <w:tcPr>
+            <w:tcW w:type="pct" w:w="1500"/>
+            <w:vAlign w:val="center"/>
+          </w:tcPr>
+          <w:p>
+            <w:r>
+              <w:rPr>
+                <w:rFonts w:ascii="Calibri" w:cs="Calibri" w:eastAsia="Calibri" w:hAnsi="Calibri"/>
+                <w:b/>
+                <w:bCs/>
+                <w:i w:val="false"/>
+                <w:iCs w:val="false"/>
+                <w:color w:val="1A2B5F"/>
+                <w:sz w:val="20"/>
+                <w:szCs w:val="20"/>
+              </w:rPr>
+              <w:t xml:space="preserve">Export Credentials PDF</w:t>
+            </w:r>
+          </w:p>
+        </w:tc>
+        <w:tc>
+          <w:tcPr>
+            <w:tcW w:type="pct" w:w="3500"/>
+            <w:vAlign w:val="center"/>
+          </w:tcPr>
+          <w:p>
+            <w:r>
+              <w:rPr>
+                <w:rFonts w:ascii="Calibri" w:cs="Calibri" w:eastAsia="Calibri" w:hAnsi="Calibri"/>
+                <w:b w:val="false"/>
+                <w:bCs w:val="false"/>
+                <w:i w:val="false"/>
+                <w:iCs w:val="false"/>
+                <w:color w:val="1E293B"/>
+                <w:sz w:val="20"/>
+                <w:szCs w:val="20"/>
+              </w:rPr>
+              <w:t xml:space="preserve">Generates a secure printable PDF roster of student voters with Grade, Section, and LRN</w:t>
             </w:r>
           </w:p>
         </w:tc>
       </w:tr>
     </w:tbl>
+    <w:p>
+      <w:pPr>
+        <w:shd w:color="FEF3C7" w:val="solid"/>
+        <w:spacing w:after="60" w:before="60"/>
+        <w:ind w:left="360"/>
+      </w:pPr>
+      <w:r>
+        <w:rPr>
+          <w:rFonts w:ascii="Calibri" w:cs="Calibri" w:eastAsia="Calibri" w:hAnsi="Calibri"/>
+          <w:color w:val="D97706"/>
+          <w:sz w:val="22"/>
+          <w:szCs w:val="22"/>
+        </w:rPr>
+        <w:t xml:space="preserve">  ⚠  </w:t>
+      </w:r>
+      <w:r>
+        <w:rPr>
+          <w:rFonts w:ascii="Calibri" w:cs="Calibri" w:eastAsia="Calibri" w:hAnsi="Calibri"/>
+          <w:b/>
+          <w:bCs/>
+          <w:color w:val="92400E"/>
+          <w:sz w:val="20"/>
+          <w:szCs w:val="20"/>
+        </w:rPr>
+        <w:t xml:space="preserve">Resetting a vote is irreversible from the student's side. Use only when necessary and with proper faculty authorization.</w:t>
+      </w:r>
+    </w:p>
+    <w:p>
+      <w:pPr>
+        <w:spacing w:after="0" w:before="0"/>
+      </w:pPr>
+      <w:r>
+        <w:rPr>
+          <w:rFonts w:ascii="Calibri" w:cs="Calibri" w:eastAsia="Calibri" w:hAnsi="Calibri"/>
+          <w:b w:val="false"/>
+          <w:bCs w:val="false"/>
+          <w:i w:val="false"/>
+          <w:iCs w:val="false"/>
+          <w:color w:val="1E293B"/>
+          <w:sz w:val="22"/>
+          <w:szCs w:val="22"/>
+        </w:rPr>
+        <w:t xml:space="preserve"/>
+      </w:r>
+    </w:p>
+    <w:p>
+      <w:pPr>
+        <w:pStyle w:val="Heading2"/>
+        <w:spacing w:after="100" w:before="300"/>
+      </w:pPr>
+      <w:r>
+        <w:rPr>
+          <w:rFonts w:ascii="Calibri" w:cs="Calibri" w:eastAsia="Calibri" w:hAnsi="Calibri"/>
+          <w:b/>
+          <w:bCs/>
+          <w:color w:val="6366F1"/>
+          <w:sz w:val="26"/>
+          <w:szCs w:val="26"/>
+        </w:rPr>
+        <w:t xml:space="preserve">6.5  Register Student (Single Entry &amp; Bulk SheetJS)</w:t>
+      </w:r>
+    </w:p>
+    <w:p>
+      <w:pPr>
+        <w:spacing w:after="60" w:before="60"/>
+        <w:jc w:val="left"/>
+      </w:pPr>
+      <w:r>
+        <w:rPr>
+          <w:rFonts w:ascii="Calibri" w:cs="Calibri" w:eastAsia="Calibri" w:hAnsi="Calibri"/>
+          <w:b w:val="false"/>
+          <w:bCs w:val="false"/>
+          <w:i w:val="false"/>
+          <w:iCs w:val="false"/>
+          <w:color w:val="1E293B"/>
+          <w:sz w:val="22"/>
+          <w:szCs w:val="22"/>
+        </w:rPr>
+        <w:t xml:space="preserve">Allows administrators to enroll verified student voters into the election registry with automatic validation and photo enrollment.</w:t>
+      </w:r>
+    </w:p>
     <w:p>
       <w:pPr>
         <w:spacing w:after="0" w:before="0"/>
@@ -4660,7 +5321,323 @@
           <w:sz w:val="22"/>
           <w:szCs w:val="22"/>
         </w:rPr>
-        <w:t xml:space="preserve">Bulk Actions</w:t>
+        <w:t xml:space="preserve">Single Student Registration</w:t>
+      </w:r>
+    </w:p>
+    <w:p>
+      <w:pPr>
+        <w:pStyle w:val="ListParagraph"/>
+        <w:numPr>
+          <w:ilvl w:val="0"/>
+          <w:numId w:val="2"/>
+        </w:numPr>
+        <w:spacing w:after="40" w:before="40"/>
+        <w:ind w:left="720" w:hanging="360"/>
+      </w:pPr>
+      <w:r>
+        <w:rPr>
+          <w:rFonts w:ascii="Calibri" w:cs="Calibri" w:eastAsia="Calibri" w:hAnsi="Calibri"/>
+          <w:b w:val="false"/>
+          <w:bCs w:val="false"/>
+          <w:i w:val="false"/>
+          <w:iCs w:val="false"/>
+          <w:color w:val="1E293B"/>
+          <w:sz w:val="22"/>
+          <w:szCs w:val="22"/>
+        </w:rPr>
+        <w:t xml:space="preserve">Input 3-box name: First Name, Middle Name, Last Name with baseline alignment.</w:t>
+      </w:r>
+    </w:p>
+    <w:p>
+      <w:pPr>
+        <w:pStyle w:val="ListParagraph"/>
+        <w:numPr>
+          <w:ilvl w:val="0"/>
+          <w:numId w:val="2"/>
+        </w:numPr>
+        <w:spacing w:after="40" w:before="40"/>
+        <w:ind w:left="720" w:hanging="360"/>
+      </w:pPr>
+      <w:r>
+        <w:rPr>
+          <w:rFonts w:ascii="Calibri" w:cs="Calibri" w:eastAsia="Calibri" w:hAnsi="Calibri"/>
+          <w:b w:val="false"/>
+          <w:bCs w:val="false"/>
+          <w:i w:val="false"/>
+          <w:iCs w:val="false"/>
+          <w:color w:val="1E293B"/>
+          <w:sz w:val="22"/>
+          <w:szCs w:val="22"/>
+        </w:rPr>
+        <w:t xml:space="preserve">Input 12-digit Learner Reference Number (LRN) verified against regex ^\d{12}$.</w:t>
+      </w:r>
+    </w:p>
+    <w:p>
+      <w:pPr>
+        <w:pStyle w:val="ListParagraph"/>
+        <w:numPr>
+          <w:ilvl w:val="0"/>
+          <w:numId w:val="2"/>
+        </w:numPr>
+        <w:spacing w:after="40" w:before="40"/>
+        <w:ind w:left="720" w:hanging="360"/>
+      </w:pPr>
+      <w:r>
+        <w:rPr>
+          <w:rFonts w:ascii="Calibri" w:cs="Calibri" w:eastAsia="Calibri" w:hAnsi="Calibri"/>
+          <w:b w:val="false"/>
+          <w:bCs w:val="false"/>
+          <w:i w:val="false"/>
+          <w:iCs w:val="false"/>
+          <w:color w:val="1E293B"/>
+          <w:sz w:val="22"/>
+          <w:szCs w:val="22"/>
+        </w:rPr>
+        <w:t xml:space="preserve">Assign Grade Level and Section (dynamic dropdown restricted to school sections).</w:t>
+      </w:r>
+    </w:p>
+    <w:p>
+      <w:pPr>
+        <w:pStyle w:val="ListParagraph"/>
+        <w:numPr>
+          <w:ilvl w:val="0"/>
+          <w:numId w:val="2"/>
+        </w:numPr>
+        <w:spacing w:after="40" w:before="40"/>
+        <w:ind w:left="720" w:hanging="360"/>
+      </w:pPr>
+      <w:r>
+        <w:rPr>
+          <w:rFonts w:ascii="Calibri" w:cs="Calibri" w:eastAsia="Calibri" w:hAnsi="Calibri"/>
+          <w:b w:val="false"/>
+          <w:bCs w:val="false"/>
+          <w:i w:val="false"/>
+          <w:iCs w:val="false"/>
+          <w:color w:val="1E293B"/>
+          <w:sz w:val="22"/>
+          <w:szCs w:val="22"/>
+        </w:rPr>
+        <w:t xml:space="preserve">Capture Biometric Photo: Upload an image file or take a snapshot via webcam with client-side JPEG compression.</w:t>
+      </w:r>
+    </w:p>
+    <w:p>
+      <w:pPr>
+        <w:pStyle w:val="ListParagraph"/>
+        <w:numPr>
+          <w:ilvl w:val="0"/>
+          <w:numId w:val="2"/>
+        </w:numPr>
+        <w:spacing w:after="40" w:before="40"/>
+        <w:ind w:left="720" w:hanging="360"/>
+      </w:pPr>
+      <w:r>
+        <w:rPr>
+          <w:rFonts w:ascii="Calibri" w:cs="Calibri" w:eastAsia="Calibri" w:hAnsi="Calibri"/>
+          <w:b w:val="false"/>
+          <w:bCs w:val="false"/>
+          <w:i w:val="false"/>
+          <w:iCs w:val="false"/>
+          <w:color w:val="1E293B"/>
+          <w:sz w:val="22"/>
+          <w:szCs w:val="22"/>
+        </w:rPr>
+        <w:t xml:space="preserve">Click "Register Student". Credentials and biometric reference are committed to Supabase and logged in audit.</w:t>
+      </w:r>
+    </w:p>
+    <w:p>
+      <w:pPr>
+        <w:spacing w:after="0" w:before="0"/>
+      </w:pPr>
+      <w:r>
+        <w:rPr>
+          <w:rFonts w:ascii="Calibri" w:cs="Calibri" w:eastAsia="Calibri" w:hAnsi="Calibri"/>
+          <w:b w:val="false"/>
+          <w:bCs w:val="false"/>
+          <w:i w:val="false"/>
+          <w:iCs w:val="false"/>
+          <w:color w:val="1E293B"/>
+          <w:sz w:val="22"/>
+          <w:szCs w:val="22"/>
+        </w:rPr>
+        <w:t xml:space="preserve"/>
+      </w:r>
+    </w:p>
+    <w:p>
+      <w:pPr>
+        <w:pStyle w:val="Heading3"/>
+        <w:spacing w:after="80" w:before="200"/>
+      </w:pPr>
+      <w:r>
+        <w:rPr>
+          <w:rFonts w:ascii="Calibri" w:cs="Calibri" w:eastAsia="Calibri" w:hAnsi="Calibri"/>
+          <w:b/>
+          <w:bCs/>
+          <w:color w:val="0D9488"/>
+          <w:sz w:val="22"/>
+          <w:szCs w:val="22"/>
+        </w:rPr>
+        <w:t xml:space="preserve">Bulk Spreadsheet Import (SheetJS Engine)</w:t>
+      </w:r>
+    </w:p>
+    <w:p>
+      <w:pPr>
+        <w:pStyle w:val="ListParagraph"/>
+        <w:numPr>
+          <w:ilvl w:val="0"/>
+          <w:numId w:val="2"/>
+        </w:numPr>
+        <w:spacing w:after="40" w:before="40"/>
+        <w:ind w:left="720" w:hanging="360"/>
+      </w:pPr>
+      <w:r>
+        <w:rPr>
+          <w:rFonts w:ascii="Calibri" w:cs="Calibri" w:eastAsia="Calibri" w:hAnsi="Calibri"/>
+          <w:b w:val="false"/>
+          <w:bCs w:val="false"/>
+          <w:i w:val="false"/>
+          <w:iCs w:val="false"/>
+          <w:color w:val="1E293B"/>
+          <w:sz w:val="22"/>
+          <w:szCs w:val="22"/>
+        </w:rPr>
+        <w:t xml:space="preserve">Prepare an Excel (.xlsx/.xls) or CSV spreadsheet with student columns (first_name, last_name, lrn, grade, section).</w:t>
+      </w:r>
+    </w:p>
+    <w:p>
+      <w:pPr>
+        <w:pStyle w:val="ListParagraph"/>
+        <w:numPr>
+          <w:ilvl w:val="0"/>
+          <w:numId w:val="2"/>
+        </w:numPr>
+        <w:spacing w:after="40" w:before="40"/>
+        <w:ind w:left="720" w:hanging="360"/>
+      </w:pPr>
+      <w:r>
+        <w:rPr>
+          <w:rFonts w:ascii="Calibri" w:cs="Calibri" w:eastAsia="Calibri" w:hAnsi="Calibri"/>
+          <w:b w:val="false"/>
+          <w:bCs w:val="false"/>
+          <w:i w:val="false"/>
+          <w:iCs w:val="false"/>
+          <w:color w:val="1E293B"/>
+          <w:sz w:val="22"/>
+          <w:szCs w:val="22"/>
+        </w:rPr>
+        <w:t xml:space="preserve">Click "Import CSV / Excel" and select the file. The SheetJS parser validates row formats and highlights invalid rows.</w:t>
+      </w:r>
+    </w:p>
+    <w:p>
+      <w:pPr>
+        <w:pStyle w:val="ListParagraph"/>
+        <w:numPr>
+          <w:ilvl w:val="0"/>
+          <w:numId w:val="2"/>
+        </w:numPr>
+        <w:spacing w:after="40" w:before="40"/>
+        <w:ind w:left="720" w:hanging="360"/>
+      </w:pPr>
+      <w:r>
+        <w:rPr>
+          <w:rFonts w:ascii="Calibri" w:cs="Calibri" w:eastAsia="Calibri" w:hAnsi="Calibri"/>
+          <w:b w:val="false"/>
+          <w:bCs w:val="false"/>
+          <w:i w:val="false"/>
+          <w:iCs w:val="false"/>
+          <w:color w:val="1E293B"/>
+          <w:sz w:val="22"/>
+          <w:szCs w:val="22"/>
+        </w:rPr>
+        <w:t xml:space="preserve">Preview records and confirm batch insertion into Supabase with duplicate LRN collision detection.</w:t>
+      </w:r>
+    </w:p>
+    <w:p>
+      <w:pPr>
+        <w:spacing w:after="0" w:before="0"/>
+      </w:pPr>
+      <w:r>
+        <w:rPr>
+          <w:rFonts w:ascii="Calibri" w:cs="Calibri" w:eastAsia="Calibri" w:hAnsi="Calibri"/>
+          <w:b w:val="false"/>
+          <w:bCs w:val="false"/>
+          <w:i w:val="false"/>
+          <w:iCs w:val="false"/>
+          <w:color w:val="1E293B"/>
+          <w:sz w:val="22"/>
+          <w:szCs w:val="22"/>
+        </w:rPr>
+        <w:t xml:space="preserve"/>
+      </w:r>
+    </w:p>
+    <w:p>
+      <w:pPr>
+        <w:pStyle w:val="Heading2"/>
+        <w:spacing w:after="100" w:before="300"/>
+      </w:pPr>
+      <w:r>
+        <w:rPr>
+          <w:rFonts w:ascii="Calibri" w:cs="Calibri" w:eastAsia="Calibri" w:hAnsi="Calibri"/>
+          <w:b/>
+          <w:bCs/>
+          <w:color w:val="6366F1"/>
+          <w:sz w:val="26"/>
+          <w:szCs w:val="26"/>
+        </w:rPr>
+        <w:t xml:space="preserve">6.6  Partylist Slate Management</w:t>
+      </w:r>
+    </w:p>
+    <w:p>
+      <w:pPr>
+        <w:spacing w:after="60" w:before="60"/>
+        <w:jc w:val="left"/>
+      </w:pPr>
+      <w:r>
+        <w:rPr>
+          <w:rFonts w:ascii="Calibri" w:cs="Calibri" w:eastAsia="Calibri" w:hAnsi="Calibri"/>
+          <w:b w:val="false"/>
+          <w:bCs w:val="false"/>
+          <w:i w:val="false"/>
+          <w:iCs w:val="false"/>
+          <w:color w:val="1E293B"/>
+          <w:sz w:val="22"/>
+          <w:szCs w:val="22"/>
+        </w:rPr>
+        <w:t xml:space="preserve">Central hub for managing political party slates, accredited emblems, platform goals, and member affiliations.</w:t>
+      </w:r>
+    </w:p>
+    <w:p>
+      <w:pPr>
+        <w:spacing w:after="0" w:before="0"/>
+      </w:pPr>
+      <w:r>
+        <w:rPr>
+          <w:rFonts w:ascii="Calibri" w:cs="Calibri" w:eastAsia="Calibri" w:hAnsi="Calibri"/>
+          <w:b w:val="false"/>
+          <w:bCs w:val="false"/>
+          <w:i w:val="false"/>
+          <w:iCs w:val="false"/>
+          <w:color w:val="1E293B"/>
+          <w:sz w:val="22"/>
+          <w:szCs w:val="22"/>
+        </w:rPr>
+        <w:t xml:space="preserve"/>
+      </w:r>
+    </w:p>
+    <w:p>
+      <w:pPr>
+        <w:pStyle w:val="Heading3"/>
+        <w:spacing w:after="80" w:before="200"/>
+      </w:pPr>
+      <w:r>
+        <w:rPr>
+          <w:rFonts w:ascii="Calibri" w:cs="Calibri" w:eastAsia="Calibri" w:hAnsi="Calibri"/>
+          <w:b/>
+          <w:bCs/>
+          <w:color w:val="0D9488"/>
+          <w:sz w:val="22"/>
+          <w:szCs w:val="22"/>
+        </w:rPr>
+        <w:t xml:space="preserve">Partylist Controls</w:t>
       </w:r>
     </w:p>
     <w:tbl>
@@ -4698,7 +5675,7 @@
                 <w:sz w:val="20"/>
                 <w:szCs w:val="20"/>
               </w:rPr>
-              <w:t xml:space="preserve">Download Credentials PDF</w:t>
+              <w:t xml:space="preserve">Add Partylist</w:t>
             </w:r>
           </w:p>
         </w:tc>
@@ -4719,7 +5696,7 @@
                 <w:sz w:val="20"/>
                 <w:szCs w:val="20"/>
               </w:rPr>
-              <w:t xml:space="preserve">Prompts for admin password; generates a printable PDF of all student LRNs and passwords</w:t>
+              <w:t xml:space="preserve">Register a new slate with official party name, short code, and custom hex color badge</w:t>
             </w:r>
           </w:p>
         </w:tc>
@@ -4742,7 +5719,7 @@
                 <w:sz w:val="20"/>
                 <w:szCs w:val="20"/>
               </w:rPr>
-              <w:t xml:space="preserve">Refresh</w:t>
+              <w:t xml:space="preserve">Edit Partylist</w:t>
             </w:r>
           </w:p>
         </w:tc>
@@ -4763,39 +5740,101 @@
                 <w:sz w:val="20"/>
                 <w:szCs w:val="20"/>
               </w:rPr>
-              <w:t xml:space="preserve">Reloads the voter list from Supabase</w:t>
+              <w:t xml:space="preserve">Update party platform, color badge, or executive description</w:t>
+            </w:r>
+          </w:p>
+        </w:tc>
+      </w:tr>
+      <w:tr>
+        <w:tc>
+          <w:tcPr>
+            <w:tcW w:type="pct" w:w="1500"/>
+            <w:shd w:color="F1F5F9" w:val="solid"/>
+            <w:vAlign w:val="center"/>
+          </w:tcPr>
+          <w:p>
+            <w:r>
+              <w:rPr>
+                <w:rFonts w:ascii="Calibri" w:cs="Calibri" w:eastAsia="Calibri" w:hAnsi="Calibri"/>
+                <w:b/>
+                <w:bCs/>
+                <w:i w:val="false"/>
+                <w:iCs w:val="false"/>
+                <w:color w:val="1A2B5F"/>
+                <w:sz w:val="20"/>
+                <w:szCs w:val="20"/>
+              </w:rPr>
+              <w:t xml:space="preserve">Delete Partylist</w:t>
+            </w:r>
+          </w:p>
+        </w:tc>
+        <w:tc>
+          <w:tcPr>
+            <w:tcW w:type="pct" w:w="3500"/>
+            <w:vAlign w:val="center"/>
+          </w:tcPr>
+          <w:p>
+            <w:r>
+              <w:rPr>
+                <w:rFonts w:ascii="Calibri" w:cs="Calibri" w:eastAsia="Calibri" w:hAnsi="Calibri"/>
+                <w:b w:val="false"/>
+                <w:bCs w:val="false"/>
+                <w:i w:val="false"/>
+                <w:iCs w:val="false"/>
+                <w:color w:val="1E293B"/>
+                <w:sz w:val="20"/>
+                <w:szCs w:val="20"/>
+              </w:rPr>
+              <w:t xml:space="preserve">Permanently removes party slate and gracefully unlinks candidates without deleting candidate records</w:t>
+            </w:r>
+          </w:p>
+        </w:tc>
+      </w:tr>
+      <w:tr>
+        <w:tc>
+          <w:tcPr>
+            <w:tcW w:type="pct" w:w="1500"/>
+            <w:vAlign w:val="center"/>
+          </w:tcPr>
+          <w:p>
+            <w:r>
+              <w:rPr>
+                <w:rFonts w:ascii="Calibri" w:cs="Calibri" w:eastAsia="Calibri" w:hAnsi="Calibri"/>
+                <w:b/>
+                <w:bCs/>
+                <w:i w:val="false"/>
+                <w:iCs w:val="false"/>
+                <w:color w:val="1A2B5F"/>
+                <w:sz w:val="20"/>
+                <w:szCs w:val="20"/>
+              </w:rPr>
+              <w:t xml:space="preserve">Slate Inspection</w:t>
+            </w:r>
+          </w:p>
+        </w:tc>
+        <w:tc>
+          <w:tcPr>
+            <w:tcW w:type="pct" w:w="3500"/>
+            <w:vAlign w:val="center"/>
+          </w:tcPr>
+          <w:p>
+            <w:r>
+              <w:rPr>
+                <w:rFonts w:ascii="Calibri" w:cs="Calibri" w:eastAsia="Calibri" w:hAnsi="Calibri"/>
+                <w:b w:val="false"/>
+                <w:bCs w:val="false"/>
+                <w:i w:val="false"/>
+                <w:iCs w:val="false"/>
+                <w:color w:val="1E293B"/>
+                <w:sz w:val="20"/>
+                <w:szCs w:val="20"/>
+              </w:rPr>
+              <w:t xml:space="preserve">Inspect all candidates registered under the selected partylist across all positions</w:t>
             </w:r>
           </w:p>
         </w:tc>
       </w:tr>
     </w:tbl>
-    <w:p>
-      <w:pPr>
-        <w:shd w:color="FEF3C7" w:val="solid"/>
-        <w:spacing w:after="60" w:before="60"/>
-        <w:ind w:left="360"/>
-      </w:pPr>
-      <w:r>
-        <w:rPr>
-          <w:rFonts w:ascii="Calibri" w:cs="Calibri" w:eastAsia="Calibri" w:hAnsi="Calibri"/>
-          <w:color w:val="D97706"/>
-          <w:sz w:val="22"/>
-          <w:szCs w:val="22"/>
-        </w:rPr>
-        <w:t xml:space="preserve">  ⚠  </w:t>
-      </w:r>
-      <w:r>
-        <w:rPr>
-          <w:rFonts w:ascii="Calibri" w:cs="Calibri" w:eastAsia="Calibri" w:hAnsi="Calibri"/>
-          <w:b/>
-          <w:bCs/>
-          <w:color w:val="92400E"/>
-          <w:sz w:val="20"/>
-          <w:szCs w:val="20"/>
-        </w:rPr>
-        <w:t xml:space="preserve">Resetting a vote is irreversible from the student's side. Use only when necessary and with proper authorization.</w:t>
-      </w:r>
-    </w:p>
     <w:p>
       <w:pPr>
         <w:spacing w:after="0" w:before="0"/>
@@ -4828,7 +5867,7 @@
           <w:sz w:val="26"/>
           <w:szCs w:val="26"/>
         </w:rPr>
-        <w:t xml:space="preserve">6.3  Voter Registration</w:t>
+        <w:t xml:space="preserve">6.7  Election Settings &amp; Cutoff Timer</w:t>
       </w:r>
     </w:p>
     <w:p>
@@ -4847,7 +5886,7 @@
           <w:sz w:val="22"/>
           <w:szCs w:val="22"/>
         </w:rPr>
-        <w:t xml:space="preserve">Allows administrators to register new student voters individually or in bulk.</w:t>
+        <w:t xml:space="preserve">Administrative controls for configuring official voting start/end cutoff timestamps and campus parameters.</w:t>
       </w:r>
     </w:p>
     <w:p>
@@ -4882,7 +5921,7 @@
           <w:sz w:val="22"/>
           <w:szCs w:val="22"/>
         </w:rPr>
-        <w:t xml:space="preserve">Single Registration</w:t>
+        <w:t xml:space="preserve">Cutoff Timer Controls</w:t>
       </w:r>
     </w:p>
     <w:p>
@@ -4906,7 +5945,7 @@
           <w:sz w:val="22"/>
           <w:szCs w:val="22"/>
         </w:rPr>
-        <w:t xml:space="preserve">Fill in: Name, LRN (12 digits), Password, Grade, Section (optional), Age (optional), Mobile Number (optional).</w:t>
+        <w:t xml:space="preserve">Configure election closing timestamp using the date-time picker.</w:t>
       </w:r>
     </w:p>
     <w:p>
@@ -4930,7 +5969,7 @@
           <w:sz w:val="22"/>
           <w:szCs w:val="22"/>
         </w:rPr>
-        <w:t xml:space="preserve">Upload a student photo (optional; uses a realistic fallback if omitted).</w:t>
+        <w:t xml:space="preserve">Click "Set Timer". The real-time countdown synchronizes to all active client devices.</w:t>
       </w:r>
     </w:p>
     <w:p>
@@ -4954,42 +5993,7 @@
           <w:sz w:val="22"/>
           <w:szCs w:val="22"/>
         </w:rPr>
-        <w:t xml:space="preserve">Click "Register Voter".</w:t>
-      </w:r>
-    </w:p>
-    <w:p>
-      <w:pPr>
-        <w:spacing w:after="0" w:before="0"/>
-      </w:pPr>
-      <w:r>
-        <w:rPr>
-          <w:rFonts w:ascii="Calibri" w:cs="Calibri" w:eastAsia="Calibri" w:hAnsi="Calibri"/>
-          <w:b w:val="false"/>
-          <w:bCs w:val="false"/>
-          <w:i w:val="false"/>
-          <w:iCs w:val="false"/>
-          <w:color w:val="1E293B"/>
-          <w:sz w:val="22"/>
-          <w:szCs w:val="22"/>
-        </w:rPr>
-        <w:t xml:space="preserve"/>
-      </w:r>
-    </w:p>
-    <w:p>
-      <w:pPr>
-        <w:pStyle w:val="Heading3"/>
-        <w:spacing w:after="80" w:before="200"/>
-      </w:pPr>
-      <w:r>
-        <w:rPr>
-          <w:rFonts w:ascii="Calibri" w:cs="Calibri" w:eastAsia="Calibri" w:hAnsi="Calibri"/>
-          <w:b/>
-          <w:bCs/>
-          <w:color w:val="0D9488"/>
-          <w:sz w:val="22"/>
-          <w:szCs w:val="22"/>
-        </w:rPr>
-        <w:t xml:space="preserve">Bulk CSV Import</w:t>
+        <w:t xml:space="preserve">Hard Cutoff Enforcement: Once the countdown reaches 00:00:00, student login is automatically locked down.</w:t>
       </w:r>
     </w:p>
     <w:p>
@@ -5013,55 +6017,7 @@
           <w:sz w:val="22"/>
           <w:szCs w:val="22"/>
         </w:rPr>
-        <w:t xml:space="preserve">Prepare a CSV file with columns: name, id (LRN), password, grade, section, age, mobile_number.</w:t>
-      </w:r>
-    </w:p>
-    <w:p>
-      <w:pPr>
-        <w:pStyle w:val="ListParagraph"/>
-        <w:numPr>
-          <w:ilvl w:val="0"/>
-          <w:numId w:val="2"/>
-        </w:numPr>
-        <w:spacing w:after="40" w:before="40"/>
-        <w:ind w:left="720" w:hanging="360"/>
-      </w:pPr>
-      <w:r>
-        <w:rPr>
-          <w:rFonts w:ascii="Calibri" w:cs="Calibri" w:eastAsia="Calibri" w:hAnsi="Calibri"/>
-          <w:b w:val="false"/>
-          <w:bCs w:val="false"/>
-          <w:i w:val="false"/>
-          <w:iCs w:val="false"/>
-          <w:color w:val="1E293B"/>
-          <w:sz w:val="22"/>
-          <w:szCs w:val="22"/>
-        </w:rPr>
-        <w:t xml:space="preserve">Click "Import CSV" and select the file.</w:t>
-      </w:r>
-    </w:p>
-    <w:p>
-      <w:pPr>
-        <w:pStyle w:val="ListParagraph"/>
-        <w:numPr>
-          <w:ilvl w:val="0"/>
-          <w:numId w:val="2"/>
-        </w:numPr>
-        <w:spacing w:after="40" w:before="40"/>
-        <w:ind w:left="720" w:hanging="360"/>
-      </w:pPr>
-      <w:r>
-        <w:rPr>
-          <w:rFonts w:ascii="Calibri" w:cs="Calibri" w:eastAsia="Calibri" w:hAnsi="Calibri"/>
-          <w:b w:val="false"/>
-          <w:bCs w:val="false"/>
-          <w:i w:val="false"/>
-          <w:iCs w:val="false"/>
-          <w:color w:val="1E293B"/>
-          <w:sz w:val="22"/>
-          <w:szCs w:val="22"/>
-        </w:rPr>
-        <w:t xml:space="preserve">Review the preview and click "Confirm Import".</w:t>
+        <w:t xml:space="preserve">To extend voting hours or halt an election, faculty administrators can adjust or clear the timer with password re-authentication.</w:t>
       </w:r>
     </w:p>
     <w:p>
@@ -5096,7 +6052,7 @@
           <w:sz w:val="26"/>
           <w:szCs w:val="26"/>
         </w:rPr>
-        <w:t xml:space="preserve">6.4  Partylist Management</w:t>
+        <w:t xml:space="preserve">6.8  Results &amp; Analytics Dashboard</w:t>
       </w:r>
     </w:p>
     <w:p>
@@ -5115,7 +6071,7 @@
           <w:sz w:val="22"/>
           <w:szCs w:val="22"/>
         </w:rPr>
-        <w:t xml:space="preserve">Manage political party affiliations for candidates.</w:t>
+        <w:t xml:space="preserve">Real-time election tallying and graphical tabulation with position-by-position breakdowns and analytics.</w:t>
       </w:r>
     </w:p>
     <w:p>
@@ -5150,7 +6106,216 @@
           <w:sz w:val="22"/>
           <w:szCs w:val="22"/>
         </w:rPr>
-        <w:t xml:space="preserve">Partylist Actions</w:t>
+        <w:t xml:space="preserve">Dashboard Features</w:t>
+      </w:r>
+    </w:p>
+    <w:p>
+      <w:pPr>
+        <w:pStyle w:val="ListParagraph"/>
+        <w:numPr>
+          <w:ilvl w:val="0"/>
+          <w:numId w:val="1"/>
+        </w:numPr>
+        <w:spacing w:after="40" w:before="40"/>
+        <w:ind w:left="360"/>
+      </w:pPr>
+      <w:r>
+        <w:rPr>
+          <w:rFonts w:ascii="Calibri" w:cs="Calibri" w:eastAsia="Calibri" w:hAnsi="Calibri"/>
+          <w:b w:val="false"/>
+          <w:bCs w:val="false"/>
+          <w:i w:val="false"/>
+          <w:iCs w:val="false"/>
+          <w:color w:val="1E293B"/>
+          <w:sz w:val="22"/>
+          <w:szCs w:val="22"/>
+        </w:rPr>
+        <w:t xml:space="preserve">Live Tabulation: Automatic re-calculation of cast ballots from the votes table in Supabase</w:t>
+      </w:r>
+    </w:p>
+    <w:p>
+      <w:pPr>
+        <w:pStyle w:val="ListParagraph"/>
+        <w:numPr>
+          <w:ilvl w:val="0"/>
+          <w:numId w:val="1"/>
+        </w:numPr>
+        <w:spacing w:after="40" w:before="40"/>
+        <w:ind w:left="360"/>
+      </w:pPr>
+      <w:r>
+        <w:rPr>
+          <w:rFonts w:ascii="Calibri" w:cs="Calibri" w:eastAsia="Calibri" w:hAnsi="Calibri"/>
+          <w:b w:val="false"/>
+          <w:bCs w:val="false"/>
+          <w:i w:val="false"/>
+          <w:iCs w:val="false"/>
+          <w:color w:val="1E293B"/>
+          <w:sz w:val="22"/>
+          <w:szCs w:val="22"/>
+        </w:rPr>
+        <w:t xml:space="preserve">Winner Highlighting: Leading candidate per position marked with a golden winner ribbon</w:t>
+      </w:r>
+    </w:p>
+    <w:p>
+      <w:pPr>
+        <w:pStyle w:val="ListParagraph"/>
+        <w:numPr>
+          <w:ilvl w:val="0"/>
+          <w:numId w:val="1"/>
+        </w:numPr>
+        <w:spacing w:after="40" w:before="40"/>
+        <w:ind w:left="360"/>
+      </w:pPr>
+      <w:r>
+        <w:rPr>
+          <w:rFonts w:ascii="Calibri" w:cs="Calibri" w:eastAsia="Calibri" w:hAnsi="Calibri"/>
+          <w:b w:val="false"/>
+          <w:bCs w:val="false"/>
+          <w:i w:val="false"/>
+          <w:iCs w:val="false"/>
+          <w:color w:val="1E293B"/>
+          <w:sz w:val="22"/>
+          <w:szCs w:val="22"/>
+        </w:rPr>
+        <w:t xml:space="preserve">Voter Turnout Metric: Real-time calculation of (Voted Students / Total Registered Students) * 100%</w:t>
+      </w:r>
+    </w:p>
+    <w:p>
+      <w:pPr>
+        <w:pStyle w:val="ListParagraph"/>
+        <w:numPr>
+          <w:ilvl w:val="0"/>
+          <w:numId w:val="1"/>
+        </w:numPr>
+        <w:spacing w:after="40" w:before="40"/>
+        <w:ind w:left="360"/>
+      </w:pPr>
+      <w:r>
+        <w:rPr>
+          <w:rFonts w:ascii="Calibri" w:cs="Calibri" w:eastAsia="Calibri" w:hAnsi="Calibri"/>
+          <w:b w:val="false"/>
+          <w:bCs w:val="false"/>
+          <w:i w:val="false"/>
+          <w:iCs w:val="false"/>
+          <w:color w:val="1E293B"/>
+          <w:sz w:val="22"/>
+          <w:szCs w:val="22"/>
+        </w:rPr>
+        <w:t xml:space="preserve">Turnout by Grade &amp; Section: Drill-down metrics displaying participation percentages across grade levels</w:t>
+      </w:r>
+    </w:p>
+    <w:p>
+      <w:pPr>
+        <w:pStyle w:val="ListParagraph"/>
+        <w:numPr>
+          <w:ilvl w:val="0"/>
+          <w:numId w:val="1"/>
+        </w:numPr>
+        <w:spacing w:after="40" w:before="40"/>
+        <w:ind w:left="360"/>
+      </w:pPr>
+      <w:r>
+        <w:rPr>
+          <w:rFonts w:ascii="Calibri" w:cs="Calibri" w:eastAsia="Calibri" w:hAnsi="Calibri"/>
+          <w:b w:val="false"/>
+          <w:bCs w:val="false"/>
+          <w:i w:val="false"/>
+          <w:iCs w:val="false"/>
+          <w:color w:val="1E293B"/>
+          <w:sz w:val="22"/>
+          <w:szCs w:val="22"/>
+        </w:rPr>
+        <w:t xml:space="preserve">Export Engine: Download official election certificates as PDF, raw counts as CSV, or print a formatted tally sheet</w:t>
+      </w:r>
+    </w:p>
+    <w:p>
+      <w:pPr>
+        <w:spacing w:after="0" w:before="0"/>
+      </w:pPr>
+      <w:r>
+        <w:rPr>
+          <w:rFonts w:ascii="Calibri" w:cs="Calibri" w:eastAsia="Calibri" w:hAnsi="Calibri"/>
+          <w:b w:val="false"/>
+          <w:bCs w:val="false"/>
+          <w:i w:val="false"/>
+          <w:iCs w:val="false"/>
+          <w:color w:val="1E293B"/>
+          <w:sz w:val="22"/>
+          <w:szCs w:val="22"/>
+        </w:rPr>
+        <w:t xml:space="preserve"/>
+      </w:r>
+    </w:p>
+    <w:p>
+      <w:pPr>
+        <w:pStyle w:val="Heading2"/>
+        <w:spacing w:after="100" w:before="300"/>
+      </w:pPr>
+      <w:r>
+        <w:rPr>
+          <w:rFonts w:ascii="Calibri" w:cs="Calibri" w:eastAsia="Calibri" w:hAnsi="Calibri"/>
+          <w:b/>
+          <w:bCs/>
+          <w:color w:val="6366F1"/>
+          <w:sz w:val="26"/>
+          <w:szCs w:val="26"/>
+        </w:rPr>
+        <w:t xml:space="preserve">6.9  Audit Logs &amp; Investigation Console</w:t>
+      </w:r>
+    </w:p>
+    <w:p>
+      <w:pPr>
+        <w:spacing w:after="60" w:before="60"/>
+        <w:jc w:val="left"/>
+      </w:pPr>
+      <w:r>
+        <w:rPr>
+          <w:rFonts w:ascii="Calibri" w:cs="Calibri" w:eastAsia="Calibri" w:hAnsi="Calibri"/>
+          <w:b w:val="false"/>
+          <w:bCs w:val="false"/>
+          <w:i w:val="false"/>
+          <w:iCs w:val="false"/>
+          <w:color w:val="1E293B"/>
+          <w:sz w:val="22"/>
+          <w:szCs w:val="22"/>
+        </w:rPr>
+        <w:t xml:space="preserve">Cryptographically backed, chronological record of every security and administrative event across the system.</w:t>
+      </w:r>
+    </w:p>
+    <w:p>
+      <w:pPr>
+        <w:spacing w:after="0" w:before="0"/>
+      </w:pPr>
+      <w:r>
+        <w:rPr>
+          <w:rFonts w:ascii="Calibri" w:cs="Calibri" w:eastAsia="Calibri" w:hAnsi="Calibri"/>
+          <w:b w:val="false"/>
+          <w:bCs w:val="false"/>
+          <w:i w:val="false"/>
+          <w:iCs w:val="false"/>
+          <w:color w:val="1E293B"/>
+          <w:sz w:val="22"/>
+          <w:szCs w:val="22"/>
+        </w:rPr>
+        <w:t xml:space="preserve"/>
+      </w:r>
+    </w:p>
+    <w:p>
+      <w:pPr>
+        <w:pStyle w:val="Heading3"/>
+        <w:spacing w:after="80" w:before="200"/>
+      </w:pPr>
+      <w:r>
+        <w:rPr>
+          <w:rFonts w:ascii="Calibri" w:cs="Calibri" w:eastAsia="Calibri" w:hAnsi="Calibri"/>
+          <w:b/>
+          <w:bCs/>
+          <w:color w:val="0D9488"/>
+          <w:sz w:val="22"/>
+          <w:szCs w:val="22"/>
+        </w:rPr>
+        <w:t xml:space="preserve">Audit Inspection Tools</w:t>
       </w:r>
     </w:p>
     <w:tbl>
@@ -5188,7 +6353,7 @@
                 <w:sz w:val="20"/>
                 <w:szCs w:val="20"/>
               </w:rPr>
-              <w:t xml:space="preserve">Add Partylist</w:t>
+              <w:t xml:space="preserve">Scoped Search</w:t>
             </w:r>
           </w:p>
         </w:tc>
@@ -5209,7 +6374,7 @@
                 <w:sz w:val="20"/>
                 <w:szCs w:val="20"/>
               </w:rPr>
-              <w:t xml:space="preserve">Enter a name, code, colour, and optional description, then save</w:t>
+              <w:t xml:space="preserve">Filter audit records by actor name, action category, timestamp, or specific target LRN</w:t>
             </w:r>
           </w:p>
         </w:tc>
@@ -5232,7 +6397,7 @@
                 <w:sz w:val="20"/>
                 <w:szCs w:val="20"/>
               </w:rPr>
-              <w:t xml:space="preserve">Edit Partylist</w:t>
+              <w:t xml:space="preserve">Category Filters</w:t>
             </w:r>
           </w:p>
         </w:tc>
@@ -5253,7 +6418,7 @@
                 <w:sz w:val="20"/>
                 <w:szCs w:val="20"/>
               </w:rPr>
-              <w:t xml:space="preserve">Update the name, code, colour, or description of an existing partylist</w:t>
+              <w:t xml:space="preserve">Filter by Logins &amp; Sessions, Voter Registration, Candidate Management, Votes &amp; Ballots, Security &amp; Key Access, Election Settings, Resets &amp; Deletions</w:t>
             </w:r>
           </w:p>
         </w:tc>
@@ -5277,7 +6442,7 @@
                 <w:sz w:val="20"/>
                 <w:szCs w:val="20"/>
               </w:rPr>
-              <w:t xml:space="preserve">Delete Partylist</w:t>
+              <w:t xml:space="preserve">Dual-Layer Architecture</w:t>
             </w:r>
           </w:p>
         </w:tc>
@@ -5298,7 +6463,7 @@
                 <w:sz w:val="20"/>
                 <w:szCs w:val="20"/>
               </w:rPr>
-              <w:t xml:space="preserve">Permanently removes the partylist and unlinks all candidates (logged to audit)</w:t>
+              <w:t xml:space="preserve">Simultaneously persisted in PostgreSQL audit_logs and local offline fallback storage</w:t>
             </w:r>
           </w:p>
         </w:tc>
@@ -5321,7 +6486,7 @@
                 <w:sz w:val="20"/>
                 <w:szCs w:val="20"/>
               </w:rPr>
-              <w:t xml:space="preserve">View Candidates</w:t>
+              <w:t xml:space="preserve">Export CSV</w:t>
             </w:r>
           </w:p>
         </w:tc>
@@ -5342,83 +6507,12 @@
                 <w:sz w:val="20"/>
                 <w:szCs w:val="20"/>
               </w:rPr>
-              <w:t xml:space="preserve">See all candidates belonging to a partylist in a detail panel</w:t>
-            </w:r>
-          </w:p>
-        </w:tc>
-      </w:tr>
-      <w:tr>
-        <w:tc>
-          <w:tcPr>
-            <w:tcW w:type="pct" w:w="1500"/>
-            <w:shd w:color="F1F5F9" w:val="solid"/>
-            <w:vAlign w:val="center"/>
-          </w:tcPr>
-          <w:p>
-            <w:r>
-              <w:rPr>
-                <w:rFonts w:ascii="Calibri" w:cs="Calibri" w:eastAsia="Calibri" w:hAnsi="Calibri"/>
-                <w:b/>
-                <w:bCs/>
-                <w:i w:val="false"/>
-                <w:iCs w:val="false"/>
-                <w:color w:val="1A2B5F"/>
-                <w:sz w:val="20"/>
-                <w:szCs w:val="20"/>
-              </w:rPr>
-              <w:t xml:space="preserve">Assign Candidate</w:t>
-            </w:r>
-          </w:p>
-        </w:tc>
-        <w:tc>
-          <w:tcPr>
-            <w:tcW w:type="pct" w:w="3500"/>
-            <w:vAlign w:val="center"/>
-          </w:tcPr>
-          <w:p>
-            <w:r>
-              <w:rPr>
-                <w:rFonts w:ascii="Calibri" w:cs="Calibri" w:eastAsia="Calibri" w:hAnsi="Calibri"/>
-                <w:b w:val="false"/>
-                <w:bCs w:val="false"/>
-                <w:i w:val="false"/>
-                <w:iCs w:val="false"/>
-                <w:color w:val="1E293B"/>
-                <w:sz w:val="20"/>
-                <w:szCs w:val="20"/>
-              </w:rPr>
-              <w:t xml:space="preserve">Link an existing candidate to this partylist</w:t>
+              <w:t xml:space="preserve">Export raw audit trails for faculty oversight and compliance archiving</w:t>
             </w:r>
           </w:p>
         </w:tc>
       </w:tr>
     </w:tbl>
-    <w:p>
-      <w:pPr>
-        <w:spacing w:after="60" w:before="60"/>
-        <w:ind w:left="360"/>
-      </w:pPr>
-      <w:r>
-        <w:rPr>
-          <w:rFonts w:ascii="Calibri" w:cs="Calibri" w:eastAsia="Calibri" w:hAnsi="Calibri"/>
-          <w:color w:val="64748B"/>
-          <w:sz w:val="22"/>
-          <w:szCs w:val="22"/>
-        </w:rPr>
-        <w:t xml:space="preserve">  ℹ  </w:t>
-      </w:r>
-      <w:r>
-        <w:rPr>
-          <w:rFonts w:ascii="Calibri" w:cs="Calibri" w:eastAsia="Calibri" w:hAnsi="Calibri"/>
-          <w:i/>
-          <w:iCs/>
-          <w:color w:val="64748B"/>
-          <w:sz w:val="20"/>
-          <w:szCs w:val="20"/>
-        </w:rPr>
-        <w:t xml:space="preserve">Each partylist is displayed with its colour badge on the candidate cards throughout the system.</w:t>
-      </w:r>
-    </w:p>
     <w:p>
       <w:pPr>
         <w:spacing w:after="0" w:before="0"/>
@@ -5451,7 +6545,7 @@
           <w:sz w:val="26"/>
           <w:szCs w:val="26"/>
         </w:rPr>
-        <w:t xml:space="preserve">6.5  Election Settings</w:t>
+        <w:t xml:space="preserve">6.10  Digital Seal Verification Console</w:t>
       </w:r>
     </w:p>
     <w:p>
@@ -5470,7 +6564,7 @@
           <w:sz w:val="22"/>
           <w:szCs w:val="22"/>
         </w:rPr>
-        <w:t xml:space="preserve">Configure the election countdown timer — the hard cutoff after which student login is blocked.</w:t>
+        <w:t xml:space="preserve">Dedicated forensic verification console allowing faculty administrators to mathematically prove ballot integrity.</w:t>
       </w:r>
     </w:p>
     <w:p>
@@ -5505,218 +6599,7 @@
           <w:sz w:val="22"/>
           <w:szCs w:val="22"/>
         </w:rPr>
-        <w:t xml:space="preserve">Timer Controls</w:t>
-      </w:r>
-    </w:p>
-    <w:p>
-      <w:pPr>
-        <w:pStyle w:val="ListParagraph"/>
-        <w:numPr>
-          <w:ilvl w:val="0"/>
-          <w:numId w:val="2"/>
-        </w:numPr>
-        <w:spacing w:after="40" w:before="40"/>
-        <w:ind w:left="720" w:hanging="360"/>
-      </w:pPr>
-      <w:r>
-        <w:rPr>
-          <w:rFonts w:ascii="Calibri" w:cs="Calibri" w:eastAsia="Calibri" w:hAnsi="Calibri"/>
-          <w:b w:val="false"/>
-          <w:bCs w:val="false"/>
-          <w:i w:val="false"/>
-          <w:iCs w:val="false"/>
-          <w:color w:val="1E293B"/>
-          <w:sz w:val="22"/>
-          <w:szCs w:val="22"/>
-        </w:rPr>
-        <w:t xml:space="preserve">Click the date-time picker and select the election end date and time.</w:t>
-      </w:r>
-    </w:p>
-    <w:p>
-      <w:pPr>
-        <w:pStyle w:val="ListParagraph"/>
-        <w:numPr>
-          <w:ilvl w:val="0"/>
-          <w:numId w:val="2"/>
-        </w:numPr>
-        <w:spacing w:after="40" w:before="40"/>
-        <w:ind w:left="720" w:hanging="360"/>
-      </w:pPr>
-      <w:r>
-        <w:rPr>
-          <w:rFonts w:ascii="Calibri" w:cs="Calibri" w:eastAsia="Calibri" w:hAnsi="Calibri"/>
-          <w:b w:val="false"/>
-          <w:bCs w:val="false"/>
-          <w:i w:val="false"/>
-          <w:iCs w:val="false"/>
-          <w:color w:val="1E293B"/>
-          <w:sz w:val="22"/>
-          <w:szCs w:val="22"/>
-        </w:rPr>
-        <w:t xml:space="preserve">Click "Set Timer". The countdown appears on the student login page and ballot.</w:t>
-      </w:r>
-    </w:p>
-    <w:p>
-      <w:pPr>
-        <w:pStyle w:val="ListParagraph"/>
-        <w:numPr>
-          <w:ilvl w:val="0"/>
-          <w:numId w:val="2"/>
-        </w:numPr>
-        <w:spacing w:after="40" w:before="40"/>
-        <w:ind w:left="720" w:hanging="360"/>
-      </w:pPr>
-      <w:r>
-        <w:rPr>
-          <w:rFonts w:ascii="Calibri" w:cs="Calibri" w:eastAsia="Calibri" w:hAnsi="Calibri"/>
-          <w:b w:val="false"/>
-          <w:bCs w:val="false"/>
-          <w:i w:val="false"/>
-          <w:iCs w:val="false"/>
-          <w:color w:val="1E293B"/>
-          <w:sz w:val="22"/>
-          <w:szCs w:val="22"/>
-        </w:rPr>
-        <w:t xml:space="preserve">To extend or move the deadline, pick a new time and click "Set Timer" again.</w:t>
-      </w:r>
-    </w:p>
-    <w:p>
-      <w:pPr>
-        <w:pStyle w:val="ListParagraph"/>
-        <w:numPr>
-          <w:ilvl w:val="0"/>
-          <w:numId w:val="2"/>
-        </w:numPr>
-        <w:spacing w:after="40" w:before="40"/>
-        <w:ind w:left="720" w:hanging="360"/>
-      </w:pPr>
-      <w:r>
-        <w:rPr>
-          <w:rFonts w:ascii="Calibri" w:cs="Calibri" w:eastAsia="Calibri" w:hAnsi="Calibri"/>
-          <w:b w:val="false"/>
-          <w:bCs w:val="false"/>
-          <w:i w:val="false"/>
-          <w:iCs w:val="false"/>
-          <w:color w:val="1E293B"/>
-          <w:sz w:val="22"/>
-          <w:szCs w:val="22"/>
-        </w:rPr>
-        <w:t xml:space="preserve">To stop the election immediately, click "Clear Timer" and confirm.</w:t>
-      </w:r>
-    </w:p>
-    <w:p>
-      <w:pPr>
-        <w:spacing w:after="60" w:before="60"/>
-        <w:ind w:left="360"/>
-      </w:pPr>
-      <w:r>
-        <w:rPr>
-          <w:rFonts w:ascii="Calibri" w:cs="Calibri" w:eastAsia="Calibri" w:hAnsi="Calibri"/>
-          <w:color w:val="64748B"/>
-          <w:sz w:val="22"/>
-          <w:szCs w:val="22"/>
-        </w:rPr>
-        <w:t xml:space="preserve">  ℹ  </w:t>
-      </w:r>
-      <w:r>
-        <w:rPr>
-          <w:rFonts w:ascii="Calibri" w:cs="Calibri" w:eastAsia="Calibri" w:hAnsi="Calibri"/>
-          <w:i/>
-          <w:iCs/>
-          <w:color w:val="64748B"/>
-          <w:sz w:val="20"/>
-          <w:szCs w:val="20"/>
-        </w:rPr>
-        <w:t xml:space="preserve">Setting or clearing the timer is logged in the audit log as TIMER_UPDATED.</w:t>
-      </w:r>
-    </w:p>
-    <w:p>
-      <w:pPr>
-        <w:spacing w:after="0" w:before="0"/>
-      </w:pPr>
-      <w:r>
-        <w:rPr>
-          <w:rFonts w:ascii="Calibri" w:cs="Calibri" w:eastAsia="Calibri" w:hAnsi="Calibri"/>
-          <w:b w:val="false"/>
-          <w:bCs w:val="false"/>
-          <w:i w:val="false"/>
-          <w:iCs w:val="false"/>
-          <w:color w:val="1E293B"/>
-          <w:sz w:val="22"/>
-          <w:szCs w:val="22"/>
-        </w:rPr>
-        <w:t xml:space="preserve"/>
-      </w:r>
-    </w:p>
-    <w:p>
-      <w:pPr>
-        <w:pStyle w:val="Heading2"/>
-        <w:spacing w:after="100" w:before="300"/>
-      </w:pPr>
-      <w:r>
-        <w:rPr>
-          <w:rFonts w:ascii="Calibri" w:cs="Calibri" w:eastAsia="Calibri" w:hAnsi="Calibri"/>
-          <w:b/>
-          <w:bCs/>
-          <w:color w:val="6366F1"/>
-          <w:sz w:val="26"/>
-          <w:szCs w:val="26"/>
-        </w:rPr>
-        <w:t xml:space="preserve">6.6  Results Dashboard</w:t>
-      </w:r>
-    </w:p>
-    <w:p>
-      <w:pPr>
-        <w:spacing w:after="60" w:before="60"/>
-        <w:jc w:val="left"/>
-      </w:pPr>
-      <w:r>
-        <w:rPr>
-          <w:rFonts w:ascii="Calibri" w:cs="Calibri" w:eastAsia="Calibri" w:hAnsi="Calibri"/>
-          <w:b w:val="false"/>
-          <w:bCs w:val="false"/>
-          <w:i w:val="false"/>
-          <w:iCs w:val="false"/>
-          <w:color w:val="1E293B"/>
-          <w:sz w:val="22"/>
-          <w:szCs w:val="22"/>
-        </w:rPr>
-        <w:t xml:space="preserve">Live vote tallying with graphical bars per position. Accessible to both admins and students (students see it after voting).</w:t>
-      </w:r>
-    </w:p>
-    <w:p>
-      <w:pPr>
-        <w:spacing w:after="0" w:before="0"/>
-      </w:pPr>
-      <w:r>
-        <w:rPr>
-          <w:rFonts w:ascii="Calibri" w:cs="Calibri" w:eastAsia="Calibri" w:hAnsi="Calibri"/>
-          <w:b w:val="false"/>
-          <w:bCs w:val="false"/>
-          <w:i w:val="false"/>
-          <w:iCs w:val="false"/>
-          <w:color w:val="1E293B"/>
-          <w:sz w:val="22"/>
-          <w:szCs w:val="22"/>
-        </w:rPr>
-        <w:t xml:space="preserve"/>
-      </w:r>
-    </w:p>
-    <w:p>
-      <w:pPr>
-        <w:pStyle w:val="Heading3"/>
-        <w:spacing w:after="80" w:before="200"/>
-      </w:pPr>
-      <w:r>
-        <w:rPr>
-          <w:rFonts w:ascii="Calibri" w:cs="Calibri" w:eastAsia="Calibri" w:hAnsi="Calibri"/>
-          <w:b/>
-          <w:bCs/>
-          <w:color w:val="0D9488"/>
-          <w:sz w:val="22"/>
-          <w:szCs w:val="22"/>
-        </w:rPr>
-        <w:t xml:space="preserve">Features</w:t>
+        <w:t xml:space="preserve">Verification Workflow</w:t>
       </w:r>
     </w:p>
     <w:p>
@@ -5740,7 +6623,7 @@
           <w:sz w:val="22"/>
           <w:szCs w:val="22"/>
         </w:rPr>
-        <w:t xml:space="preserve">Position-by-position breakdown with vote counts and percentage bars</w:t>
+        <w:t xml:space="preserve">Paste any student ballot receipt hash or upload receipt data into the console</w:t>
       </w:r>
     </w:p>
     <w:p>
@@ -5764,7 +6647,7 @@
           <w:sz w:val="22"/>
           <w:szCs w:val="22"/>
         </w:rPr>
-        <w:t xml:space="preserve">Winner highlighted with a gold crown badge</w:t>
+        <w:t xml:space="preserve">The cryptographic engine runs verifyBallotSeal() to recompute SHA-256 hash against Supabase records</w:t>
       </w:r>
     </w:p>
     <w:p>
@@ -5788,7 +6671,100 @@
           <w:sz w:val="22"/>
           <w:szCs w:val="22"/>
         </w:rPr>
-        <w:t xml:space="preserve">Partylist colour indicators next to candidate names</w:t>
+        <w:t xml:space="preserve">Confirms whether the vote record is untampered, valid, and unaltered since original casting</w:t>
+      </w:r>
+    </w:p>
+    <w:p>
+      <w:pPr>
+        <w:spacing w:after="0" w:before="0"/>
+      </w:pPr>
+      <w:r>
+        <w:rPr>
+          <w:rFonts w:ascii="Calibri" w:cs="Calibri" w:eastAsia="Calibri" w:hAnsi="Calibri"/>
+          <w:b w:val="false"/>
+          <w:bCs w:val="false"/>
+          <w:i w:val="false"/>
+          <w:iCs w:val="false"/>
+          <w:color w:val="1E293B"/>
+          <w:sz w:val="22"/>
+          <w:szCs w:val="22"/>
+        </w:rPr>
+        <w:t xml:space="preserve"/>
+      </w:r>
+    </w:p>
+    <w:p>
+      <w:pPr>
+        <w:spacing w:after="0" w:before="0"/>
+      </w:pPr>
+      <w:r>
+        <w:rPr>
+          <w:rFonts w:ascii="Calibri" w:cs="Calibri" w:eastAsia="Calibri" w:hAnsi="Calibri"/>
+          <w:b w:val="false"/>
+          <w:bCs w:val="false"/>
+          <w:i w:val="false"/>
+          <w:iCs w:val="false"/>
+          <w:color w:val="1E293B"/>
+          <w:sz w:val="22"/>
+          <w:szCs w:val="22"/>
+        </w:rPr>
+        <w:t xml:space="preserve"/>
+      </w:r>
+    </w:p>
+    <w:p>
+      <w:pPr>
+        <w:pStyle w:val="Heading1"/>
+        <w:pBdr>
+          <w:bottom w:val="single" w:color="1A2B5F" w:sz="6" w:space="4"/>
+        </w:pBdr>
+        <w:spacing w:after="160" w:before="400"/>
+      </w:pPr>
+      <w:r>
+        <w:rPr>
+          <w:rFonts w:ascii="Calibri" w:cs="Calibri" w:eastAsia="Calibri" w:hAnsi="Calibri"/>
+          <w:b/>
+          <w:bCs/>
+          <w:caps/>
+          <w:color w:val="1A2B5F"/>
+          <w:sz w:val="32"/>
+          <w:szCs w:val="32"/>
+        </w:rPr>
+        <w:t xml:space="preserve">7. Core Security &amp; Verification Systems</w:t>
+      </w:r>
+    </w:p>
+    <w:p>
+      <w:pPr>
+        <w:pStyle w:val="Heading2"/>
+        <w:spacing w:after="100" w:before="300"/>
+      </w:pPr>
+      <w:r>
+        <w:rPr>
+          <w:rFonts w:ascii="Calibri" w:cs="Calibri" w:eastAsia="Calibri" w:hAnsi="Calibri"/>
+          <w:b/>
+          <w:bCs/>
+          <w:color w:val="6366F1"/>
+          <w:sz w:val="26"/>
+          <w:szCs w:val="26"/>
+        </w:rPr>
+        <w:t xml:space="preserve">7.1  Face-API.js Biometric Facial Recognition</w:t>
+      </w:r>
+    </w:p>
+    <w:p>
+      <w:pPr>
+        <w:spacing w:after="60" w:before="60"/>
+        <w:jc w:val="left"/>
+      </w:pPr>
+      <w:r>
+        <w:rPr>
+          <w:rFonts w:ascii="Calibri" w:cs="Calibri" w:eastAsia="Calibri" w:hAnsi="Calibri"/>
+          <w:b w:val="false"/>
+          <w:bCs w:val="false"/>
+          <w:i w:val="false"/>
+          <w:iCs w:val="false"/>
+          <w:color w:val="1E293B"/>
+          <w:sz w:val="22"/>
+          <w:szCs w:val="22"/>
+        </w:rPr>
+        <w:t xml:space="preserve">Client-side biometric authentication powered by TensorFlow.js and Face-API.js models (SSD MobileNet V1, 68-Point Face Landmark, Face Recognition Net).</w:t>
       </w:r>
     </w:p>
     <w:p>
@@ -5812,7 +6788,7 @@
           <w:sz w:val="22"/>
           <w:szCs w:val="22"/>
         </w:rPr>
-        <w:t xml:space="preserve">Voter turnout summary (total voted vs. total registered)</w:t>
+        <w:t xml:space="preserve">loadFaceApiModels(): Pre-loads quantized neural network weights from /models directory with indexed caching.</w:t>
       </w:r>
     </w:p>
     <w:p>
@@ -5836,496 +6812,7 @@
           <w:sz w:val="22"/>
           <w:szCs w:val="22"/>
         </w:rPr>
-        <w:t xml:space="preserve">Refresh button to reload live counts</w:t>
-      </w:r>
-    </w:p>
-    <w:p>
-      <w:pPr>
-        <w:spacing w:after="0" w:before="0"/>
-      </w:pPr>
-      <w:r>
-        <w:rPr>
-          <w:rFonts w:ascii="Calibri" w:cs="Calibri" w:eastAsia="Calibri" w:hAnsi="Calibri"/>
-          <w:b w:val="false"/>
-          <w:bCs w:val="false"/>
-          <w:i w:val="false"/>
-          <w:iCs w:val="false"/>
-          <w:color w:val="1E293B"/>
-          <w:sz w:val="22"/>
-          <w:szCs w:val="22"/>
-        </w:rPr>
-        <w:t xml:space="preserve"/>
-      </w:r>
-    </w:p>
-    <w:p>
-      <w:pPr>
-        <w:pStyle w:val="Heading2"/>
-        <w:spacing w:after="100" w:before="300"/>
-      </w:pPr>
-      <w:r>
-        <w:rPr>
-          <w:rFonts w:ascii="Calibri" w:cs="Calibri" w:eastAsia="Calibri" w:hAnsi="Calibri"/>
-          <w:b/>
-          <w:bCs/>
-          <w:color w:val="6366F1"/>
-          <w:sz w:val="26"/>
-          <w:szCs w:val="26"/>
-        </w:rPr>
-        <w:t xml:space="preserve">6.7  Download Results</w:t>
-      </w:r>
-    </w:p>
-    <w:p>
-      <w:pPr>
-        <w:spacing w:after="60" w:before="60"/>
-        <w:jc w:val="left"/>
-      </w:pPr>
-      <w:r>
-        <w:rPr>
-          <w:rFonts w:ascii="Calibri" w:cs="Calibri" w:eastAsia="Calibri" w:hAnsi="Calibri"/>
-          <w:b w:val="false"/>
-          <w:bCs w:val="false"/>
-          <w:i w:val="false"/>
-          <w:iCs w:val="false"/>
-          <w:color w:val="1E293B"/>
-          <w:sz w:val="22"/>
-          <w:szCs w:val="22"/>
-        </w:rPr>
-        <w:t xml:space="preserve">Export election results for reporting and archiving.</w:t>
-      </w:r>
-    </w:p>
-    <w:p>
-      <w:pPr>
-        <w:spacing w:after="0" w:before="0"/>
-      </w:pPr>
-      <w:r>
-        <w:rPr>
-          <w:rFonts w:ascii="Calibri" w:cs="Calibri" w:eastAsia="Calibri" w:hAnsi="Calibri"/>
-          <w:b w:val="false"/>
-          <w:bCs w:val="false"/>
-          <w:i w:val="false"/>
-          <w:iCs w:val="false"/>
-          <w:color w:val="1E293B"/>
-          <w:sz w:val="22"/>
-          <w:szCs w:val="22"/>
-        </w:rPr>
-        <w:t xml:space="preserve"/>
-      </w:r>
-    </w:p>
-    <w:p>
-      <w:pPr>
-        <w:pStyle w:val="Heading3"/>
-        <w:spacing w:after="80" w:before="200"/>
-      </w:pPr>
-      <w:r>
-        <w:rPr>
-          <w:rFonts w:ascii="Calibri" w:cs="Calibri" w:eastAsia="Calibri" w:hAnsi="Calibri"/>
-          <w:b/>
-          <w:bCs/>
-          <w:color w:val="0D9488"/>
-          <w:sz w:val="22"/>
-          <w:szCs w:val="22"/>
-        </w:rPr>
-        <w:t xml:space="preserve">Export Options</w:t>
-      </w:r>
-    </w:p>
-    <w:tbl>
-      <w:tblPr>
-        <w:tblW w:type="pct" w:w="5000"/>
-        <w:tblBorders>
-          <w:top w:val="single" w:color="6366F1" w:sz="2"/>
-          <w:left w:val="single" w:color="6366F1" w:sz="2"/>
-          <w:bottom w:val="single" w:color="6366F1" w:sz="2"/>
-          <w:right w:val="single" w:color="6366F1" w:sz="2"/>
-          <w:insideH w:val="single" w:color="auto" w:sz="4"/>
-          <w:insideV w:val="single" w:color="auto" w:sz="4"/>
-        </w:tblBorders>
-      </w:tblPr>
-      <w:tblGrid>
-        <w:gridCol w:w="2600"/>
-        <w:gridCol w:w="6066"/>
-      </w:tblGrid>
-      <w:tr>
-        <w:tc>
-          <w:tcPr>
-            <w:tcW w:type="pct" w:w="1500"/>
-            <w:shd w:color="F1F5F9" w:val="solid"/>
-            <w:vAlign w:val="center"/>
-          </w:tcPr>
-          <w:p>
-            <w:r>
-              <w:rPr>
-                <w:rFonts w:ascii="Calibri" w:cs="Calibri" w:eastAsia="Calibri" w:hAnsi="Calibri"/>
-                <w:b/>
-                <w:bCs/>
-                <w:i w:val="false"/>
-                <w:iCs w:val="false"/>
-                <w:color w:val="1A2B5F"/>
-                <w:sz w:val="20"/>
-                <w:szCs w:val="20"/>
-              </w:rPr>
-              <w:t xml:space="preserve">Download PDF</w:t>
-            </w:r>
-          </w:p>
-        </w:tc>
-        <w:tc>
-          <w:tcPr>
-            <w:tcW w:type="pct" w:w="3500"/>
-            <w:vAlign w:val="center"/>
-          </w:tcPr>
-          <w:p>
-            <w:r>
-              <w:rPr>
-                <w:rFonts w:ascii="Calibri" w:cs="Calibri" w:eastAsia="Calibri" w:hAnsi="Calibri"/>
-                <w:b w:val="false"/>
-                <w:bCs w:val="false"/>
-                <w:i w:val="false"/>
-                <w:iCs w:val="false"/>
-                <w:color w:val="1E293B"/>
-                <w:sz w:val="20"/>
-                <w:szCs w:val="20"/>
-              </w:rPr>
-              <w:t xml:space="preserve">Generates a formatted results report as a PDF file</w:t>
-            </w:r>
-          </w:p>
-        </w:tc>
-      </w:tr>
-      <w:tr>
-        <w:tc>
-          <w:tcPr>
-            <w:tcW w:type="pct" w:w="1500"/>
-            <w:vAlign w:val="center"/>
-          </w:tcPr>
-          <w:p>
-            <w:r>
-              <w:rPr>
-                <w:rFonts w:ascii="Calibri" w:cs="Calibri" w:eastAsia="Calibri" w:hAnsi="Calibri"/>
-                <w:b/>
-                <w:bCs/>
-                <w:i w:val="false"/>
-                <w:iCs w:val="false"/>
-                <w:color w:val="1A2B5F"/>
-                <w:sz w:val="20"/>
-                <w:szCs w:val="20"/>
-              </w:rPr>
-              <w:t xml:space="preserve">Download CSV</w:t>
-            </w:r>
-          </w:p>
-        </w:tc>
-        <w:tc>
-          <w:tcPr>
-            <w:tcW w:type="pct" w:w="3500"/>
-            <w:vAlign w:val="center"/>
-          </w:tcPr>
-          <w:p>
-            <w:r>
-              <w:rPr>
-                <w:rFonts w:ascii="Calibri" w:cs="Calibri" w:eastAsia="Calibri" w:hAnsi="Calibri"/>
-                <w:b w:val="false"/>
-                <w:bCs w:val="false"/>
-                <w:i w:val="false"/>
-                <w:iCs w:val="false"/>
-                <w:color w:val="1E293B"/>
-                <w:sz w:val="20"/>
-                <w:szCs w:val="20"/>
-              </w:rPr>
-              <w:t xml:space="preserve">Exports a spreadsheet-compatible CSV file with all vote counts</w:t>
-            </w:r>
-          </w:p>
-        </w:tc>
-      </w:tr>
-      <w:tr>
-        <w:tc>
-          <w:tcPr>
-            <w:tcW w:type="pct" w:w="1500"/>
-            <w:shd w:color="F1F5F9" w:val="solid"/>
-            <w:vAlign w:val="center"/>
-          </w:tcPr>
-          <w:p>
-            <w:r>
-              <w:rPr>
-                <w:rFonts w:ascii="Calibri" w:cs="Calibri" w:eastAsia="Calibri" w:hAnsi="Calibri"/>
-                <w:b/>
-                <w:bCs/>
-                <w:i w:val="false"/>
-                <w:iCs w:val="false"/>
-                <w:color w:val="1A2B5F"/>
-                <w:sz w:val="20"/>
-                <w:szCs w:val="20"/>
-              </w:rPr>
-              <w:t xml:space="preserve">Print</w:t>
-            </w:r>
-          </w:p>
-        </w:tc>
-        <w:tc>
-          <w:tcPr>
-            <w:tcW w:type="pct" w:w="3500"/>
-            <w:vAlign w:val="center"/>
-          </w:tcPr>
-          <w:p>
-            <w:r>
-              <w:rPr>
-                <w:rFonts w:ascii="Calibri" w:cs="Calibri" w:eastAsia="Calibri" w:hAnsi="Calibri"/>
-                <w:b w:val="false"/>
-                <w:bCs w:val="false"/>
-                <w:i w:val="false"/>
-                <w:iCs w:val="false"/>
-                <w:color w:val="1E293B"/>
-                <w:sz w:val="20"/>
-                <w:szCs w:val="20"/>
-              </w:rPr>
-              <w:t xml:space="preserve">Opens the browser print dialog with a print-optimized layout</w:t>
-            </w:r>
-          </w:p>
-        </w:tc>
-      </w:tr>
-    </w:tbl>
-    <w:p>
-      <w:pPr>
-        <w:spacing w:after="0" w:before="0"/>
-      </w:pPr>
-      <w:r>
-        <w:rPr>
-          <w:rFonts w:ascii="Calibri" w:cs="Calibri" w:eastAsia="Calibri" w:hAnsi="Calibri"/>
-          <w:b w:val="false"/>
-          <w:bCs w:val="false"/>
-          <w:i w:val="false"/>
-          <w:iCs w:val="false"/>
-          <w:color w:val="1E293B"/>
-          <w:sz w:val="22"/>
-          <w:szCs w:val="22"/>
-        </w:rPr>
-        <w:t xml:space="preserve"/>
-      </w:r>
-    </w:p>
-    <w:p>
-      <w:pPr>
-        <w:pStyle w:val="Heading2"/>
-        <w:spacing w:after="100" w:before="300"/>
-      </w:pPr>
-      <w:r>
-        <w:rPr>
-          <w:rFonts w:ascii="Calibri" w:cs="Calibri" w:eastAsia="Calibri" w:hAnsi="Calibri"/>
-          <w:b/>
-          <w:bCs/>
-          <w:color w:val="6366F1"/>
-          <w:sz w:val="26"/>
-          <w:szCs w:val="26"/>
-        </w:rPr>
-        <w:t xml:space="preserve">6.8  Audit Logs</w:t>
-      </w:r>
-    </w:p>
-    <w:p>
-      <w:pPr>
-        <w:spacing w:after="60" w:before="60"/>
-        <w:jc w:val="left"/>
-      </w:pPr>
-      <w:r>
-        <w:rPr>
-          <w:rFonts w:ascii="Calibri" w:cs="Calibri" w:eastAsia="Calibri" w:hAnsi="Calibri"/>
-          <w:b w:val="false"/>
-          <w:bCs w:val="false"/>
-          <w:i w:val="false"/>
-          <w:iCs w:val="false"/>
-          <w:color w:val="1E293B"/>
-          <w:sz w:val="22"/>
-          <w:szCs w:val="22"/>
-        </w:rPr>
-        <w:t xml:space="preserve">A chronological record of every significant action performed in the system, including login events, vote resets, credential access, and configuration changes.</w:t>
-      </w:r>
-    </w:p>
-    <w:p>
-      <w:pPr>
-        <w:spacing w:after="0" w:before="0"/>
-      </w:pPr>
-      <w:r>
-        <w:rPr>
-          <w:rFonts w:ascii="Calibri" w:cs="Calibri" w:eastAsia="Calibri" w:hAnsi="Calibri"/>
-          <w:b w:val="false"/>
-          <w:bCs w:val="false"/>
-          <w:i w:val="false"/>
-          <w:iCs w:val="false"/>
-          <w:color w:val="1E293B"/>
-          <w:sz w:val="22"/>
-          <w:szCs w:val="22"/>
-        </w:rPr>
-        <w:t xml:space="preserve"/>
-      </w:r>
-    </w:p>
-    <w:p>
-      <w:pPr>
-        <w:pStyle w:val="Heading3"/>
-        <w:spacing w:after="80" w:before="200"/>
-      </w:pPr>
-      <w:r>
-        <w:rPr>
-          <w:rFonts w:ascii="Calibri" w:cs="Calibri" w:eastAsia="Calibri" w:hAnsi="Calibri"/>
-          <w:b/>
-          <w:bCs/>
-          <w:color w:val="0D9488"/>
-          <w:sz w:val="22"/>
-          <w:szCs w:val="22"/>
-        </w:rPr>
-        <w:t xml:space="preserve">Filters</w:t>
-      </w:r>
-    </w:p>
-    <w:tbl>
-      <w:tblPr>
-        <w:tblW w:type="pct" w:w="5000"/>
-        <w:tblBorders>
-          <w:top w:val="single" w:color="6366F1" w:sz="2"/>
-          <w:left w:val="single" w:color="6366F1" w:sz="2"/>
-          <w:bottom w:val="single" w:color="6366F1" w:sz="2"/>
-          <w:right w:val="single" w:color="6366F1" w:sz="2"/>
-          <w:insideH w:val="single" w:color="auto" w:sz="4"/>
-          <w:insideV w:val="single" w:color="auto" w:sz="4"/>
-        </w:tblBorders>
-      </w:tblPr>
-      <w:tblGrid>
-        <w:gridCol w:w="2600"/>
-        <w:gridCol w:w="6066"/>
-      </w:tblGrid>
-      <w:tr>
-        <w:tc>
-          <w:tcPr>
-            <w:tcW w:type="pct" w:w="1500"/>
-            <w:shd w:color="F1F5F9" w:val="solid"/>
-            <w:vAlign w:val="center"/>
-          </w:tcPr>
-          <w:p>
-            <w:r>
-              <w:rPr>
-                <w:rFonts w:ascii="Calibri" w:cs="Calibri" w:eastAsia="Calibri" w:hAnsi="Calibri"/>
-                <w:b/>
-                <w:bCs/>
-                <w:i w:val="false"/>
-                <w:iCs w:val="false"/>
-                <w:color w:val="1A2B5F"/>
-                <w:sz w:val="20"/>
-                <w:szCs w:val="20"/>
-              </w:rPr>
-              <w:t xml:space="preserve">Search Bar</w:t>
-            </w:r>
-          </w:p>
-        </w:tc>
-        <w:tc>
-          <w:tcPr>
-            <w:tcW w:type="pct" w:w="3500"/>
-            <w:vAlign w:val="center"/>
-          </w:tcPr>
-          <w:p>
-            <w:r>
-              <w:rPr>
-                <w:rFonts w:ascii="Calibri" w:cs="Calibri" w:eastAsia="Calibri" w:hAnsi="Calibri"/>
-                <w:b w:val="false"/>
-                <w:bCs w:val="false"/>
-                <w:i w:val="false"/>
-                <w:iCs w:val="false"/>
-                <w:color w:val="1E293B"/>
-                <w:sz w:val="20"/>
-                <w:szCs w:val="20"/>
-              </w:rPr>
-              <w:t xml:space="preserve">Free-text search across action name, performed-by, and details fields</w:t>
-            </w:r>
-          </w:p>
-        </w:tc>
-      </w:tr>
-      <w:tr>
-        <w:tc>
-          <w:tcPr>
-            <w:tcW w:type="pct" w:w="1500"/>
-            <w:vAlign w:val="center"/>
-          </w:tcPr>
-          <w:p>
-            <w:r>
-              <w:rPr>
-                <w:rFonts w:ascii="Calibri" w:cs="Calibri" w:eastAsia="Calibri" w:hAnsi="Calibri"/>
-                <w:b/>
-                <w:bCs/>
-                <w:i w:val="false"/>
-                <w:iCs w:val="false"/>
-                <w:color w:val="1A2B5F"/>
-                <w:sz w:val="20"/>
-                <w:szCs w:val="20"/>
-              </w:rPr>
-              <w:t xml:space="preserve">Category Dropdown</w:t>
-            </w:r>
-          </w:p>
-        </w:tc>
-        <w:tc>
-          <w:tcPr>
-            <w:tcW w:type="pct" w:w="3500"/>
-            <w:vAlign w:val="center"/>
-          </w:tcPr>
-          <w:p>
-            <w:r>
-              <w:rPr>
-                <w:rFonts w:ascii="Calibri" w:cs="Calibri" w:eastAsia="Calibri" w:hAnsi="Calibri"/>
-                <w:b w:val="false"/>
-                <w:bCs w:val="false"/>
-                <w:i w:val="false"/>
-                <w:iCs w:val="false"/>
-                <w:color w:val="1E293B"/>
-                <w:sz w:val="20"/>
-                <w:szCs w:val="20"/>
-              </w:rPr>
-              <w:t xml:space="preserve">Filter by: All Categories, Logins &amp; Sessions, Voter Registration, Candidate Management, Votes &amp; Ballots, Security &amp; Access Key, Election Settings, Resets &amp; Deletions</w:t>
-            </w:r>
-          </w:p>
-        </w:tc>
-      </w:tr>
-    </w:tbl>
-    <w:p>
-      <w:pPr>
-        <w:spacing w:after="0" w:before="0"/>
-      </w:pPr>
-      <w:r>
-        <w:rPr>
-          <w:rFonts w:ascii="Calibri" w:cs="Calibri" w:eastAsia="Calibri" w:hAnsi="Calibri"/>
-          <w:b w:val="false"/>
-          <w:bCs w:val="false"/>
-          <w:i w:val="false"/>
-          <w:iCs w:val="false"/>
-          <w:color w:val="1E293B"/>
-          <w:sz w:val="22"/>
-          <w:szCs w:val="22"/>
-        </w:rPr>
-        <w:t xml:space="preserve"/>
-      </w:r>
-    </w:p>
-    <w:p>
-      <w:pPr>
-        <w:pStyle w:val="Heading3"/>
-        <w:spacing w:after="80" w:before="200"/>
-      </w:pPr>
-      <w:r>
-        <w:rPr>
-          <w:rFonts w:ascii="Calibri" w:cs="Calibri" w:eastAsia="Calibri" w:hAnsi="Calibri"/>
-          <w:b/>
-          <w:bCs/>
-          <w:color w:val="0D9488"/>
-          <w:sz w:val="22"/>
-          <w:szCs w:val="22"/>
-        </w:rPr>
-        <w:t xml:space="preserve">Metric Cards</w:t>
-      </w:r>
-    </w:p>
-    <w:p>
-      <w:pPr>
-        <w:spacing w:after="60" w:before="60"/>
-        <w:jc w:val="left"/>
-      </w:pPr>
-      <w:r>
-        <w:rPr>
-          <w:rFonts w:ascii="Calibri" w:cs="Calibri" w:eastAsia="Calibri" w:hAnsi="Calibri"/>
-          <w:b w:val="false"/>
-          <w:bCs w:val="false"/>
-          <w:i w:val="false"/>
-          <w:iCs w:val="false"/>
-          <w:color w:val="1E293B"/>
-          <w:sz w:val="22"/>
-          <w:szCs w:val="22"/>
-        </w:rPr>
-        <w:t xml:space="preserve">At the top of the audit logs page, quick-count cards show:</w:t>
+        <w:t xml:space="preserve">detectSingleFaceFromVideo(): Samples camera stream, isolates high-confidence bounding box, and computes 128-dimensional biometric floating-point descriptor.</w:t>
       </w:r>
     </w:p>
     <w:p>
@@ -6349,7 +6836,7 @@
           <w:sz w:val="22"/>
           <w:szCs w:val="22"/>
         </w:rPr>
-        <w:t xml:space="preserve">Total Audit Records</w:t>
+        <w:t xml:space="preserve">Euclidean Distance Verification: Compares live descriptor with enrolled reference descriptor. Matches are accepted only if distance &lt; 0.50 threshold.</w:t>
       </w:r>
     </w:p>
     <w:p>
@@ -6373,7 +6860,61 @@
           <w:sz w:val="22"/>
           <w:szCs w:val="22"/>
         </w:rPr>
-        <w:t xml:space="preserve">Login &amp; Sessions count (clickable filter)</w:t>
+        <w:t xml:space="preserve">No Cloud Biometrics: Descriptors are computed locally in client WebAssembly/WebGL memory; raw video is never transmitted over the network.</w:t>
+      </w:r>
+    </w:p>
+    <w:p>
+      <w:pPr>
+        <w:spacing w:after="0" w:before="0"/>
+      </w:pPr>
+      <w:r>
+        <w:rPr>
+          <w:rFonts w:ascii="Calibri" w:cs="Calibri" w:eastAsia="Calibri" w:hAnsi="Calibri"/>
+          <w:b w:val="false"/>
+          <w:bCs w:val="false"/>
+          <w:i w:val="false"/>
+          <w:iCs w:val="false"/>
+          <w:color w:val="1E293B"/>
+          <w:sz w:val="22"/>
+          <w:szCs w:val="22"/>
+        </w:rPr>
+        <w:t xml:space="preserve"/>
+      </w:r>
+    </w:p>
+    <w:p>
+      <w:pPr>
+        <w:pStyle w:val="Heading2"/>
+        <w:spacing w:after="100" w:before="300"/>
+      </w:pPr>
+      <w:r>
+        <w:rPr>
+          <w:rFonts w:ascii="Calibri" w:cs="Calibri" w:eastAsia="Calibri" w:hAnsi="Calibri"/>
+          <w:b/>
+          <w:bCs/>
+          <w:color w:val="6366F1"/>
+          <w:sz w:val="26"/>
+          <w:szCs w:val="26"/>
+        </w:rPr>
+        <w:t xml:space="preserve">7.2  Campus GPS Geofencing (Haversine Formula)</w:t>
+      </w:r>
+    </w:p>
+    <w:p>
+      <w:pPr>
+        <w:spacing w:after="60" w:before="60"/>
+        <w:jc w:val="left"/>
+      </w:pPr>
+      <w:r>
+        <w:rPr>
+          <w:rFonts w:ascii="Calibri" w:cs="Calibri" w:eastAsia="Calibri" w:hAnsi="Calibri"/>
+          <w:b w:val="false"/>
+          <w:bCs w:val="false"/>
+          <w:i w:val="false"/>
+          <w:iCs w:val="false"/>
+          <w:color w:val="1E293B"/>
+          <w:sz w:val="22"/>
+          <w:szCs w:val="22"/>
+        </w:rPr>
+        <w:t xml:space="preserve">Prevents off-campus voting fraud by validating student geolocation against designated campus boundaries prior to ballot unlocking.</w:t>
       </w:r>
     </w:p>
     <w:p>
@@ -6397,7 +6938,7 @@
           <w:sz w:val="22"/>
           <w:szCs w:val="22"/>
         </w:rPr>
-        <w:t xml:space="preserve">Admin Operations count (clickable filter)</w:t>
+        <w:t xml:space="preserve">calculateDistance(): Implements the spherical Earth Haversine formula to calculate true geographic distance in meters.</w:t>
       </w:r>
     </w:p>
     <w:p>
@@ -6421,42 +6962,7 @@
           <w:sz w:val="22"/>
           <w:szCs w:val="22"/>
         </w:rPr>
-        <w:t xml:space="preserve">Voter Activity count (clickable filter)</w:t>
-      </w:r>
-    </w:p>
-    <w:p>
-      <w:pPr>
-        <w:spacing w:after="0" w:before="0"/>
-      </w:pPr>
-      <w:r>
-        <w:rPr>
-          <w:rFonts w:ascii="Calibri" w:cs="Calibri" w:eastAsia="Calibri" w:hAnsi="Calibri"/>
-          <w:b w:val="false"/>
-          <w:bCs w:val="false"/>
-          <w:i w:val="false"/>
-          <w:iCs w:val="false"/>
-          <w:color w:val="1E293B"/>
-          <w:sz w:val="22"/>
-          <w:szCs w:val="22"/>
-        </w:rPr>
-        <w:t xml:space="preserve"/>
-      </w:r>
-    </w:p>
-    <w:p>
-      <w:pPr>
-        <w:pStyle w:val="Heading3"/>
-        <w:spacing w:after="80" w:before="200"/>
-      </w:pPr>
-      <w:r>
-        <w:rPr>
-          <w:rFonts w:ascii="Calibri" w:cs="Calibri" w:eastAsia="Calibri" w:hAnsi="Calibri"/>
-          <w:b/>
-          <w:bCs/>
-          <w:color w:val="0D9488"/>
-          <w:sz w:val="22"/>
-          <w:szCs w:val="22"/>
-        </w:rPr>
-        <w:t xml:space="preserve">Export &amp; Refresh</w:t>
+        <w:t xml:space="preserve">Geofence Radius: Standard 500-meter threshold centered around the school campus coordinates.</w:t>
       </w:r>
     </w:p>
     <w:p>
@@ -6480,7 +6986,61 @@
           <w:sz w:val="22"/>
           <w:szCs w:val="22"/>
         </w:rPr>
-        <w:t xml:space="preserve">"Download CSV" — exports the currently filtered log entries</w:t>
+        <w:t xml:space="preserve">Audit Compliance: Coordinates and accuracy metrics are checked and logged without compromising student residential privacy.</w:t>
+      </w:r>
+    </w:p>
+    <w:p>
+      <w:pPr>
+        <w:spacing w:after="0" w:before="0"/>
+      </w:pPr>
+      <w:r>
+        <w:rPr>
+          <w:rFonts w:ascii="Calibri" w:cs="Calibri" w:eastAsia="Calibri" w:hAnsi="Calibri"/>
+          <w:b w:val="false"/>
+          <w:bCs w:val="false"/>
+          <w:i w:val="false"/>
+          <w:iCs w:val="false"/>
+          <w:color w:val="1E293B"/>
+          <w:sz w:val="22"/>
+          <w:szCs w:val="22"/>
+        </w:rPr>
+        <w:t xml:space="preserve"/>
+      </w:r>
+    </w:p>
+    <w:p>
+      <w:pPr>
+        <w:pStyle w:val="Heading2"/>
+        <w:spacing w:after="100" w:before="300"/>
+      </w:pPr>
+      <w:r>
+        <w:rPr>
+          <w:rFonts w:ascii="Calibri" w:cs="Calibri" w:eastAsia="Calibri" w:hAnsi="Calibri"/>
+          <w:b/>
+          <w:bCs/>
+          <w:color w:val="6366F1"/>
+          <w:sz w:val="26"/>
+          <w:szCs w:val="26"/>
+        </w:rPr>
+        <w:t xml:space="preserve">7.3  Cryptographic Digital Seal (SHA-256 Engine)</w:t>
+      </w:r>
+    </w:p>
+    <w:p>
+      <w:pPr>
+        <w:spacing w:after="60" w:before="60"/>
+        <w:jc w:val="left"/>
+      </w:pPr>
+      <w:r>
+        <w:rPr>
+          <w:rFonts w:ascii="Calibri" w:cs="Calibri" w:eastAsia="Calibri" w:hAnsi="Calibri"/>
+          <w:b w:val="false"/>
+          <w:bCs w:val="false"/>
+          <w:i w:val="false"/>
+          <w:iCs w:val="false"/>
+          <w:color w:val="1E293B"/>
+          <w:sz w:val="22"/>
+          <w:szCs w:val="22"/>
+        </w:rPr>
+        <w:t xml:space="preserve">Guarantees post-vote non-repudiation and cryptographic ballot immutability.</w:t>
       </w:r>
     </w:p>
     <w:p>
@@ -6504,154 +7064,7 @@
           <w:sz w:val="22"/>
           <w:szCs w:val="22"/>
         </w:rPr>
-        <w:t xml:space="preserve">"Refresh Log" — reloads logs from Supabase and merges with local backup</w:t>
-      </w:r>
-    </w:p>
-    <w:p>
-      <w:pPr>
-        <w:spacing w:after="0" w:before="0"/>
-      </w:pPr>
-      <w:r>
-        <w:rPr>
-          <w:rFonts w:ascii="Calibri" w:cs="Calibri" w:eastAsia="Calibri" w:hAnsi="Calibri"/>
-          <w:b w:val="false"/>
-          <w:bCs w:val="false"/>
-          <w:i w:val="false"/>
-          <w:iCs w:val="false"/>
-          <w:color w:val="1E293B"/>
-          <w:sz w:val="22"/>
-          <w:szCs w:val="22"/>
-        </w:rPr>
-        <w:t xml:space="preserve"/>
-      </w:r>
-    </w:p>
-    <w:p>
-      <w:pPr>
-        <w:spacing w:after="0" w:before="0"/>
-      </w:pPr>
-      <w:r>
-        <w:rPr>
-          <w:rFonts w:ascii="Calibri" w:cs="Calibri" w:eastAsia="Calibri" w:hAnsi="Calibri"/>
-          <w:b w:val="false"/>
-          <w:bCs w:val="false"/>
-          <w:i w:val="false"/>
-          <w:iCs w:val="false"/>
-          <w:color w:val="1E293B"/>
-          <w:sz w:val="22"/>
-          <w:szCs w:val="22"/>
-        </w:rPr>
-        <w:t xml:space="preserve"/>
-      </w:r>
-    </w:p>
-    <w:p>
-      <w:pPr>
-        <w:pStyle w:val="Heading1"/>
-        <w:pBdr>
-          <w:bottom w:val="single" w:color="1A2B5F" w:sz="6" w:space="4"/>
-        </w:pBdr>
-        <w:spacing w:after="160" w:before="400"/>
-      </w:pPr>
-      <w:r>
-        <w:rPr>
-          <w:rFonts w:ascii="Calibri" w:cs="Calibri" w:eastAsia="Calibri" w:hAnsi="Calibri"/>
-          <w:b/>
-          <w:bCs/>
-          <w:caps/>
-          <w:color w:val="1A2B5F"/>
-          <w:sz w:val="32"/>
-          <w:szCs w:val="32"/>
-        </w:rPr>
-        <w:t xml:space="preserve">7. Security Features</w:t>
-      </w:r>
-    </w:p>
-    <w:p>
-      <w:pPr>
-        <w:pStyle w:val="Heading2"/>
-        <w:spacing w:after="100" w:before="300"/>
-      </w:pPr>
-      <w:r>
-        <w:rPr>
-          <w:rFonts w:ascii="Calibri" w:cs="Calibri" w:eastAsia="Calibri" w:hAnsi="Calibri"/>
-          <w:b/>
-          <w:bCs/>
-          <w:color w:val="6366F1"/>
-          <w:sz w:val="26"/>
-          <w:szCs w:val="26"/>
-        </w:rPr>
-        <w:t xml:space="preserve">7.1  Login Lockout</w:t>
-      </w:r>
-    </w:p>
-    <w:p>
-      <w:pPr>
-        <w:spacing w:after="60" w:before="60"/>
-        <w:jc w:val="left"/>
-      </w:pPr>
-      <w:r>
-        <w:rPr>
-          <w:rFonts w:ascii="Calibri" w:cs="Calibri" w:eastAsia="Calibri" w:hAnsi="Calibri"/>
-          <w:b w:val="false"/>
-          <w:bCs w:val="false"/>
-          <w:i w:val="false"/>
-          <w:iCs w:val="false"/>
-          <w:color w:val="1E293B"/>
-          <w:sz w:val="22"/>
-          <w:szCs w:val="22"/>
-        </w:rPr>
-        <w:t xml:space="preserve">After 3 consecutive failed student login attempts for the same LRN, the system enforces a 15-second lockout. A SECURITY_LOCKOUT event is logged with the LRN and attempt count.</w:t>
-      </w:r>
-    </w:p>
-    <w:p>
-      <w:pPr>
-        <w:spacing w:after="0" w:before="0"/>
-      </w:pPr>
-      <w:r>
-        <w:rPr>
-          <w:rFonts w:ascii="Calibri" w:cs="Calibri" w:eastAsia="Calibri" w:hAnsi="Calibri"/>
-          <w:b w:val="false"/>
-          <w:bCs w:val="false"/>
-          <w:i w:val="false"/>
-          <w:iCs w:val="false"/>
-          <w:color w:val="1E293B"/>
-          <w:sz w:val="22"/>
-          <w:szCs w:val="22"/>
-        </w:rPr>
-        <w:t xml:space="preserve"/>
-      </w:r>
-    </w:p>
-    <w:p>
-      <w:pPr>
-        <w:pStyle w:val="Heading2"/>
-        <w:spacing w:after="100" w:before="300"/>
-      </w:pPr>
-      <w:r>
-        <w:rPr>
-          <w:rFonts w:ascii="Calibri" w:cs="Calibri" w:eastAsia="Calibri" w:hAnsi="Calibri"/>
-          <w:b/>
-          <w:bCs/>
-          <w:color w:val="6366F1"/>
-          <w:sz w:val="26"/>
-          <w:szCs w:val="26"/>
-        </w:rPr>
-        <w:t xml:space="preserve">7.2  Admin Password Gate</w:t>
-      </w:r>
-    </w:p>
-    <w:p>
-      <w:pPr>
-        <w:spacing w:after="60" w:before="60"/>
-        <w:jc w:val="left"/>
-      </w:pPr>
-      <w:r>
-        <w:rPr>
-          <w:rFonts w:ascii="Calibri" w:cs="Calibri" w:eastAsia="Calibri" w:hAnsi="Calibri"/>
-          <w:b w:val="false"/>
-          <w:bCs w:val="false"/>
-          <w:i w:val="false"/>
-          <w:iCs w:val="false"/>
-          <w:color w:val="1E293B"/>
-          <w:sz w:val="22"/>
-          <w:szCs w:val="22"/>
-        </w:rPr>
-        <w:t xml:space="preserve">Sensitive operations require re-entry of the admin password (admin123) even during an active admin session:</w:t>
+        <w:t xml:space="preserve">generateDigitalSeal(ballotData): Constructs a canonical JSON payload of student LRN, candidate IDs, position mappings, timestamp, and device fingerprint, then computes a 256-bit SHA-256 cryptographic digest.</w:t>
       </w:r>
     </w:p>
     <w:p>
@@ -6675,7 +7088,7 @@
           <w:sz w:val="22"/>
           <w:szCs w:val="22"/>
         </w:rPr>
-        <w:t xml:space="preserve">Revealing a student's login password in the Voters List</w:t>
+        <w:t xml:space="preserve">Ballot Receipt: The student receives an official verification hash string and QR-compatible receipt code.</w:t>
       </w:r>
     </w:p>
     <w:p>
@@ -6699,7 +7112,61 @@
           <w:sz w:val="22"/>
           <w:szCs w:val="22"/>
         </w:rPr>
-        <w:t xml:space="preserve">Downloading the credentials PDF</w:t>
+        <w:t xml:space="preserve">verifyBallotSeal(): The admin verification console compares the stored digital seal with the recomputed hash over votes in the database to detect any database tampering or unauthorized row manipulation.</w:t>
+      </w:r>
+    </w:p>
+    <w:p>
+      <w:pPr>
+        <w:spacing w:after="0" w:before="0"/>
+      </w:pPr>
+      <w:r>
+        <w:rPr>
+          <w:rFonts w:ascii="Calibri" w:cs="Calibri" w:eastAsia="Calibri" w:hAnsi="Calibri"/>
+          <w:b w:val="false"/>
+          <w:bCs w:val="false"/>
+          <w:i w:val="false"/>
+          <w:iCs w:val="false"/>
+          <w:color w:val="1E293B"/>
+          <w:sz w:val="22"/>
+          <w:szCs w:val="22"/>
+        </w:rPr>
+        <w:t xml:space="preserve"/>
+      </w:r>
+    </w:p>
+    <w:p>
+      <w:pPr>
+        <w:pStyle w:val="Heading2"/>
+        <w:spacing w:after="100" w:before="300"/>
+      </w:pPr>
+      <w:r>
+        <w:rPr>
+          <w:rFonts w:ascii="Calibri" w:cs="Calibri" w:eastAsia="Calibri" w:hAnsi="Calibri"/>
+          <w:b/>
+          <w:bCs/>
+          <w:color w:val="6366F1"/>
+          <w:sz w:val="26"/>
+          <w:szCs w:val="26"/>
+        </w:rPr>
+        <w:t xml:space="preserve">7.4  Dual-Layer Rate Limiting &amp; Admin Password Gate</w:t>
+      </w:r>
+    </w:p>
+    <w:p>
+      <w:pPr>
+        <w:spacing w:after="60" w:before="60"/>
+        <w:jc w:val="left"/>
+      </w:pPr>
+      <w:r>
+        <w:rPr>
+          <w:rFonts w:ascii="Calibri" w:cs="Calibri" w:eastAsia="Calibri" w:hAnsi="Calibri"/>
+          <w:b w:val="false"/>
+          <w:bCs w:val="false"/>
+          <w:i w:val="false"/>
+          <w:iCs w:val="false"/>
+          <w:color w:val="1E293B"/>
+          <w:sz w:val="22"/>
+          <w:szCs w:val="22"/>
+        </w:rPr>
+        <w:t xml:space="preserve">Hardens authentication endpoints against automated brute-force attacks and unauthorized faculty action.</w:t>
       </w:r>
     </w:p>
     <w:p>
@@ -6723,7 +7190,7 @@
           <w:sz w:val="22"/>
           <w:szCs w:val="22"/>
         </w:rPr>
-        <w:t xml:space="preserve">Resetting a student's vote status</w:t>
+        <w:t xml:space="preserve">3-Attempt Lockout: 3 consecutive failed student logins triggers an automatic 15-second lockout timer with SECURITY_LOCKOUT audit logging.</w:t>
       </w:r>
     </w:p>
     <w:p>
@@ -6747,51 +7214,31 @@
           <w:sz w:val="22"/>
           <w:szCs w:val="22"/>
         </w:rPr>
-        <w:t xml:space="preserve">Viewing a student's cast ballot (Ballot Secrecy) in Student Profile</w:t>
-      </w:r>
-    </w:p>
-    <w:p>
-      <w:pPr>
-        <w:spacing w:after="0" w:before="0"/>
-      </w:pPr>
-      <w:r>
-        <w:rPr>
-          <w:rFonts w:ascii="Calibri" w:cs="Calibri" w:eastAsia="Calibri" w:hAnsi="Calibri"/>
-          <w:b w:val="false"/>
-          <w:bCs w:val="false"/>
-          <w:i w:val="false"/>
-          <w:iCs w:val="false"/>
-          <w:color w:val="1E293B"/>
-          <w:sz w:val="22"/>
-          <w:szCs w:val="22"/>
-        </w:rPr>
-        <w:t xml:space="preserve"/>
-      </w:r>
-    </w:p>
-    <w:p>
-      <w:pPr>
-        <w:spacing w:after="60" w:before="60"/>
+        <w:t xml:space="preserve">Clipboard Hijacking Defense: Prevents pasting into LRN and passcode inputs during on-campus supervised polling.</w:t>
+      </w:r>
+    </w:p>
+    <w:p>
+      <w:pPr>
+        <w:pStyle w:val="ListParagraph"/>
+        <w:numPr>
+          <w:ilvl w:val="0"/>
+          <w:numId w:val="1"/>
+        </w:numPr>
+        <w:spacing w:after="40" w:before="40"/>
         <w:ind w:left="360"/>
       </w:pPr>
       <w:r>
         <w:rPr>
           <w:rFonts w:ascii="Calibri" w:cs="Calibri" w:eastAsia="Calibri" w:hAnsi="Calibri"/>
-          <w:color w:val="64748B"/>
-          <w:sz w:val="22"/>
-          <w:szCs w:val="22"/>
-        </w:rPr>
-        <w:t xml:space="preserve">  ℹ  </w:t>
-      </w:r>
-      <w:r>
-        <w:rPr>
-          <w:rFonts w:ascii="Calibri" w:cs="Calibri" w:eastAsia="Calibri" w:hAnsi="Calibri"/>
-          <w:i/>
-          <w:iCs/>
-          <w:color w:val="64748B"/>
-          <w:sz w:val="20"/>
-          <w:szCs w:val="20"/>
-        </w:rPr>
-        <w:t xml:space="preserve">Each of these operations is individually logged to the audit trail (SECURITY_ACCESS_KEY_REVEALED, SECURITY_CREDENTIALS_EXPORTED, VOTE_STATUS_RESET, etc.).</w:t>
+          <w:b w:val="false"/>
+          <w:bCs w:val="false"/>
+          <w:i w:val="false"/>
+          <w:iCs w:val="false"/>
+          <w:color w:val="1E293B"/>
+          <w:sz w:val="22"/>
+          <w:szCs w:val="22"/>
+        </w:rPr>
+        <w:t xml:space="preserve">Admin Password Gate: Sensitive operations (passcode reveal, vote resets, ballot inspection, results export) strictly require re-verifying faculty credentials even during an active admin session.</w:t>
       </w:r>
     </w:p>
     <w:p>
@@ -6826,7 +7273,7 @@
           <w:sz w:val="26"/>
           <w:szCs w:val="26"/>
         </w:rPr>
-        <w:t xml:space="preserve">7.3  Clipboard Protection</w:t>
+        <w:t xml:space="preserve">7.5  One-Vote Enforcement &amp; Ballot Secrecy Isolation</w:t>
       </w:r>
     </w:p>
     <w:p>
@@ -6845,7 +7292,55 @@
           <w:sz w:val="22"/>
           <w:szCs w:val="22"/>
         </w:rPr>
-        <w:t xml:space="preserve">Copy-paste is blocked on the LRN and password input fields on the login screen to prevent credential misuse during exam/election periods.</w:t>
+        <w:t xml:space="preserve">Guarantees democratic fairness while strictly safeguarding student voter anonymity.</w:t>
+      </w:r>
+    </w:p>
+    <w:p>
+      <w:pPr>
+        <w:pStyle w:val="ListParagraph"/>
+        <w:numPr>
+          <w:ilvl w:val="0"/>
+          <w:numId w:val="1"/>
+        </w:numPr>
+        <w:spacing w:after="40" w:before="40"/>
+        <w:ind w:left="360"/>
+      </w:pPr>
+      <w:r>
+        <w:rPr>
+          <w:rFonts w:ascii="Calibri" w:cs="Calibri" w:eastAsia="Calibri" w:hAnsi="Calibri"/>
+          <w:b w:val="false"/>
+          <w:bCs w:val="false"/>
+          <w:i w:val="false"/>
+          <w:iCs w:val="false"/>
+          <w:color w:val="1E293B"/>
+          <w:sz w:val="22"/>
+          <w:szCs w:val="22"/>
+        </w:rPr>
+        <w:t xml:space="preserve">Pre-Submission Double-Check: Directly checks the database has_voted boolean immediately before writing votes.</w:t>
+      </w:r>
+    </w:p>
+    <w:p>
+      <w:pPr>
+        <w:pStyle w:val="ListParagraph"/>
+        <w:numPr>
+          <w:ilvl w:val="0"/>
+          <w:numId w:val="1"/>
+        </w:numPr>
+        <w:spacing w:after="40" w:before="40"/>
+        <w:ind w:left="360"/>
+      </w:pPr>
+      <w:r>
+        <w:rPr>
+          <w:rFonts w:ascii="Calibri" w:cs="Calibri" w:eastAsia="Calibri" w:hAnsi="Calibri"/>
+          <w:b w:val="false"/>
+          <w:bCs w:val="false"/>
+          <w:i w:val="false"/>
+          <w:iCs w:val="false"/>
+          <w:color w:val="1E293B"/>
+          <w:sz w:val="22"/>
+          <w:szCs w:val="22"/>
+        </w:rPr>
+        <w:t xml:space="preserve">Ballot Secrecy Isolation: Ballots are stored with decoupled voter IDs; faculty administrators cannot view a student's individual candidate selections without an authorized, audited Ballot Secrecy Override.</w:t>
       </w:r>
     </w:p>
     <w:p>
@@ -6880,7 +7375,7 @@
           <w:sz w:val="26"/>
           <w:szCs w:val="26"/>
         </w:rPr>
-        <w:t xml:space="preserve">7.4  One-Vote Enforcement</w:t>
+        <w:t xml:space="preserve">7.6  Privacy Modal &amp; Terms Acceptance</w:t>
       </w:r>
     </w:p>
     <w:p>
@@ -6899,115 +7394,7 @@
           <w:sz w:val="22"/>
           <w:szCs w:val="22"/>
         </w:rPr>
-        <w:t xml:space="preserve">Before submitting a ballot, the system re-queries the database to confirm the student has not already voted. This prevents double voting in case of session tampering.</w:t>
-      </w:r>
-    </w:p>
-    <w:p>
-      <w:pPr>
-        <w:spacing w:after="0" w:before="0"/>
-      </w:pPr>
-      <w:r>
-        <w:rPr>
-          <w:rFonts w:ascii="Calibri" w:cs="Calibri" w:eastAsia="Calibri" w:hAnsi="Calibri"/>
-          <w:b w:val="false"/>
-          <w:bCs w:val="false"/>
-          <w:i w:val="false"/>
-          <w:iCs w:val="false"/>
-          <w:color w:val="1E293B"/>
-          <w:sz w:val="22"/>
-          <w:szCs w:val="22"/>
-        </w:rPr>
-        <w:t xml:space="preserve"/>
-      </w:r>
-    </w:p>
-    <w:p>
-      <w:pPr>
-        <w:pStyle w:val="Heading2"/>
-        <w:spacing w:after="100" w:before="300"/>
-      </w:pPr>
-      <w:r>
-        <w:rPr>
-          <w:rFonts w:ascii="Calibri" w:cs="Calibri" w:eastAsia="Calibri" w:hAnsi="Calibri"/>
-          <w:b/>
-          <w:bCs/>
-          <w:color w:val="6366F1"/>
-          <w:sz w:val="26"/>
-          <w:szCs w:val="26"/>
-        </w:rPr>
-        <w:t xml:space="preserve">7.5  Session Persistence</w:t>
-      </w:r>
-    </w:p>
-    <w:p>
-      <w:pPr>
-        <w:spacing w:after="60" w:before="60"/>
-        <w:jc w:val="left"/>
-      </w:pPr>
-      <w:r>
-        <w:rPr>
-          <w:rFonts w:ascii="Calibri" w:cs="Calibri" w:eastAsia="Calibri" w:hAnsi="Calibri"/>
-          <w:b w:val="false"/>
-          <w:bCs w:val="false"/>
-          <w:i w:val="false"/>
-          <w:iCs w:val="false"/>
-          <w:color w:val="1E293B"/>
-          <w:sz w:val="22"/>
-          <w:szCs w:val="22"/>
-        </w:rPr>
-        <w:t xml:space="preserve">Sessions are stored in localStorage. On reload, the system re-fetches the student's current record from Supabase. If the record has been deleted, the session is cleared automatically.</w:t>
-      </w:r>
-    </w:p>
-    <w:p>
-      <w:pPr>
-        <w:spacing w:after="0" w:before="0"/>
-      </w:pPr>
-      <w:r>
-        <w:rPr>
-          <w:rFonts w:ascii="Calibri" w:cs="Calibri" w:eastAsia="Calibri" w:hAnsi="Calibri"/>
-          <w:b w:val="false"/>
-          <w:bCs w:val="false"/>
-          <w:i w:val="false"/>
-          <w:iCs w:val="false"/>
-          <w:color w:val="1E293B"/>
-          <w:sz w:val="22"/>
-          <w:szCs w:val="22"/>
-        </w:rPr>
-        <w:t xml:space="preserve"/>
-      </w:r>
-    </w:p>
-    <w:p>
-      <w:pPr>
-        <w:pStyle w:val="Heading2"/>
-        <w:spacing w:after="100" w:before="300"/>
-      </w:pPr>
-      <w:r>
-        <w:rPr>
-          <w:rFonts w:ascii="Calibri" w:cs="Calibri" w:eastAsia="Calibri" w:hAnsi="Calibri"/>
-          <w:b/>
-          <w:bCs/>
-          <w:color w:val="6366F1"/>
-          <w:sz w:val="26"/>
-          <w:szCs w:val="26"/>
-        </w:rPr>
-        <w:t xml:space="preserve">7.6  Privacy Modal</w:t>
-      </w:r>
-    </w:p>
-    <w:p>
-      <w:pPr>
-        <w:spacing w:after="60" w:before="60"/>
-        <w:jc w:val="left"/>
-      </w:pPr>
-      <w:r>
-        <w:rPr>
-          <w:rFonts w:ascii="Calibri" w:cs="Calibri" w:eastAsia="Calibri" w:hAnsi="Calibri"/>
-          <w:b w:val="false"/>
-          <w:bCs w:val="false"/>
-          <w:i w:val="false"/>
-          <w:iCs w:val="false"/>
-          <w:color w:val="1E293B"/>
-          <w:sz w:val="22"/>
-          <w:szCs w:val="22"/>
-        </w:rPr>
-        <w:t xml:space="preserve">A Privacy Policy modal is shown to every user on their first visit. The user must explicitly agree before accessing the application.</w:t>
+        <w:t xml:space="preserve">A mandatory Data Privacy Notice is rendered upon initial application access, requiring explicit student consent before device camera or location permissions are requested.</w:t>
       </w:r>
     </w:p>
     <w:p>

</xml_diff>